<commit_message>
v2: Vorteile und Sorgfalt zu einem Abschnitt zusammengeführt (Variante A)
Ein Abschnitt Warum PERMA Mind Academy? mit vier Karten statt zwei Abschnitten
mit zehn Punkten. Erfahrene Trainer:innen in die Team-Einleitung, Termine und
Format in die Modul-Einleitung. Word-Dokument und Doku angepasst.

Co-Authored-By: Claude Sonnet 5.5 <noreply@anthropic.com>
Claude-Session: https://claude.ai/code/session_01MKz4GkM4ZqiqVCjpUdowFX
</commit_message>
<xml_diff>
--- a/docs/Website-Inhalte-PERMA-Mind-Academy.docx
+++ b/docs/Website-Inhalte-PERMA-Mind-Academy.docx
@@ -221,7 +221,7 @@
           <w:sz w:val="21"/>
           <w:szCs w:val="21"/>
         </w:rPr>
-        <w:t xml:space="preserve">Startseite: Kopfzeile, Begrüßung, Einführung, Angebot, Ausbildungen &amp; Module, Vorteile, Sorgfalt, Team, Kontakt-Hinweis, Fußzeile</w:t>
+        <w:t xml:space="preserve">Startseite: Kopfzeile, Begrüßung, Einführung, Angebot, Ausbildungen &amp; Module, Warum PERMA Mind Academy, Team, Kontakt-Hinweis, Fußzeile</w:t>
       </w:r>
     </w:p>
     <w:p>
@@ -3306,7 +3306,17 @@
                 <w:sz w:val="21"/>
                 <w:szCs w:val="21"/>
               </w:rPr>
-              <w:t xml:space="preserve">In vier aufeinander aufbauenden Modulen entsteht ein solides Verständnis der Positiven Psychologie und ein konkreter Bezug zu Ihrem Arbeitskontext.</w:t>
+              <w:t xml:space="preserve">In vier aufeinander aufbauenden Modulen entsteht ein solides Verständnis der Positiven Psychologie und ein konkreter Bezug zu Ihrem Arbeitskontext. Termine und Format: </w:t>
+            </w:r>
+            <w:r>
+              <w:rPr>
+                <w:rFonts w:ascii="Calibri" w:cs="Calibri" w:eastAsia="Calibri" w:hAnsi="Calibri"/>
+                <w:sz w:val="21"/>
+                <w:szCs w:val="21"/>
+                <w:highlight w:val="yellow"/>
+                <w:highlightCs w:val="yellow"/>
+              </w:rPr>
+              <w:t xml:space="preserve">[Präsenz, Online oder Blockformat ergänzen]</w:t>
             </w:r>
           </w:p>
         </w:tc>
@@ -4074,7 +4084,7 @@
         <w:rPr>
           <w:rFonts w:ascii="Calibri" w:cs="Calibri" w:eastAsia="Calibri" w:hAnsi="Calibri"/>
         </w:rPr>
-        <w:t xml:space="preserve">6. Ihre Vorteile</w:t>
+        <w:t xml:space="preserve">6. Warum PERMA Mind Academy?</w:t>
       </w:r>
     </w:p>
     <w:p>
@@ -4091,7 +4101,7 @@
           <w:sz w:val="20"/>
           <w:szCs w:val="20"/>
         </w:rPr>
-        <w:t xml:space="preserve">Sechs Argumente mit Icon, in zwei Reihen.</w:t>
+        <w:t xml:space="preserve">Ein Text links und vier Karten rechts, jeweils mit Icon in einer Akzentfarbe.</w:t>
       </w:r>
     </w:p>
     <w:tbl>
@@ -4382,7 +4392,7 @@
                 <w:sz w:val="21"/>
                 <w:szCs w:val="21"/>
               </w:rPr>
-              <w:t xml:space="preserve">Ihre Vorteile</w:t>
+              <w:t xml:space="preserve">Sorgfalt vor großen Versprechen.</w:t>
             </w:r>
           </w:p>
         </w:tc>
@@ -4445,7 +4455,7 @@
                 <w:sz w:val="20"/>
                 <w:szCs w:val="20"/>
               </w:rPr>
-              <w:t xml:space="preserve">Einleitung</w:t>
+              <w:t xml:space="preserve">Text</w:t>
             </w:r>
           </w:p>
         </w:tc>
@@ -4476,7 +4486,7 @@
                 <w:sz w:val="21"/>
                 <w:szCs w:val="21"/>
               </w:rPr>
-              <w:t xml:space="preserve">Sechs Gründe, warum Fachkräfte ihre Weiterbildung in Positiver Psychologie bei uns absolvieren.</w:t>
+              <w:t xml:space="preserve">Hier geht es nicht um schnelle Rezepte. Die Academy schafft einen fundierten Rahmen, in dem Theorie, Erfahrung und professionelle Praxis miteinander in Gespräch kommen.</w:t>
             </w:r>
           </w:p>
         </w:tc>
@@ -4539,7 +4549,7 @@
                 <w:sz w:val="20"/>
                 <w:szCs w:val="20"/>
               </w:rPr>
-              <w:t xml:space="preserve">Vorteil 1</w:t>
+              <w:t xml:space="preserve">Karte 1 (Blau)</w:t>
             </w:r>
           </w:p>
         </w:tc>
@@ -4583,7 +4593,7 @@
                 <w:sz w:val="21"/>
                 <w:szCs w:val="21"/>
               </w:rPr>
-              <w:t xml:space="preserve">Die Inhalte stützen sich auf den aktuellen Forschungsstand.</w:t>
+              <w:t xml:space="preserve">Inhalte stützen sich auf den aktuellen Forschungsstand und werden nachvollziehbar eingeordnet.</w:t>
             </w:r>
           </w:p>
         </w:tc>
@@ -4646,7 +4656,7 @@
                 <w:sz w:val="20"/>
                 <w:szCs w:val="20"/>
               </w:rPr>
-              <w:t xml:space="preserve">Vorteil 2</w:t>
+              <w:t xml:space="preserve">Karte 2 (Lila)</w:t>
             </w:r>
           </w:p>
         </w:tc>
@@ -4753,7 +4763,7 @@
                 <w:sz w:val="20"/>
                 <w:szCs w:val="20"/>
               </w:rPr>
-              <w:t xml:space="preserve">Vorteil 3</w:t>
+              <w:t xml:space="preserve">Karte 3 (Orange)</w:t>
             </w:r>
           </w:p>
         </w:tc>
@@ -4784,20 +4794,30 @@
                 <w:sz w:val="21"/>
                 <w:szCs w:val="21"/>
               </w:rPr>
-              <w:t xml:space="preserve">Erfahrene Trainer:innen</w:t>
-            </w:r>
-          </w:p>
-          <w:p>
-            <w:pPr>
-              <w:spacing w:after="40" w:line="276"/>
-            </w:pPr>
-            <w:r>
-              <w:rPr>
-                <w:rFonts w:ascii="Calibri" w:cs="Calibri" w:eastAsia="Calibri" w:hAnsi="Calibri"/>
-                <w:sz w:val="21"/>
-                <w:szCs w:val="21"/>
-              </w:rPr>
-              <w:t xml:space="preserve">Lehre durch Fachleute mit Praxiserfahrung.</w:t>
+              <w:t xml:space="preserve">Persönlich begleitet</w:t>
+            </w:r>
+          </w:p>
+          <w:p>
+            <w:pPr>
+              <w:spacing w:after="40" w:line="276"/>
+            </w:pPr>
+            <w:r>
+              <w:rPr>
+                <w:rFonts w:ascii="Calibri" w:cs="Calibri" w:eastAsia="Calibri" w:hAnsi="Calibri"/>
+                <w:sz w:val="21"/>
+                <w:szCs w:val="21"/>
+              </w:rPr>
+              <w:t xml:space="preserve">Kleine Gruppen, Raum für Fragen und Reflexion. </w:t>
+            </w:r>
+            <w:r>
+              <w:rPr>
+                <w:rFonts w:ascii="Calibri" w:cs="Calibri" w:eastAsia="Calibri" w:hAnsi="Calibri"/>
+                <w:sz w:val="21"/>
+                <w:szCs w:val="21"/>
+                <w:highlight w:val="yellow"/>
+                <w:highlightCs w:val="yellow"/>
+              </w:rPr>
+              <w:t xml:space="preserve">[Gruppengröße ergänzen]</w:t>
             </w:r>
           </w:p>
         </w:tc>
@@ -4860,7 +4880,7 @@
                 <w:sz w:val="20"/>
                 <w:szCs w:val="20"/>
               </w:rPr>
-              <w:t xml:space="preserve">Vorteil 4</w:t>
+              <w:t xml:space="preserve">Karte 4 (Grün)</w:t>
             </w:r>
           </w:p>
         </w:tc>
@@ -4891,20 +4911,20 @@
                 <w:sz w:val="21"/>
                 <w:szCs w:val="21"/>
               </w:rPr>
-              <w:t xml:space="preserve">Kleine Gruppen</w:t>
-            </w:r>
-          </w:p>
-          <w:p>
-            <w:pPr>
-              <w:spacing w:after="40" w:line="276"/>
-            </w:pPr>
-            <w:r>
-              <w:rPr>
-                <w:rFonts w:ascii="Calibri" w:cs="Calibri" w:eastAsia="Calibri" w:hAnsi="Calibri"/>
-                <w:sz w:val="21"/>
-                <w:szCs w:val="21"/>
-              </w:rPr>
-              <w:t xml:space="preserve">Raum für Fragen, Austausch und persönliche Begleitung. </w:t>
+              <w:t xml:space="preserve">Nachvollziehbarer Abschluss</w:t>
+            </w:r>
+          </w:p>
+          <w:p>
+            <w:pPr>
+              <w:spacing w:after="40" w:line="276"/>
+            </w:pPr>
+            <w:r>
+              <w:rPr>
+                <w:rFonts w:ascii="Calibri" w:cs="Calibri" w:eastAsia="Calibri" w:hAnsi="Calibri"/>
+                <w:sz w:val="21"/>
+                <w:szCs w:val="21"/>
+              </w:rPr>
+              <w:t xml:space="preserve">Ein Zertifikat, das Ihre Kompetenz belegt. </w:t>
             </w:r>
             <w:r>
               <w:rPr>
@@ -4914,225 +4934,7 @@
                 <w:highlight w:val="yellow"/>
                 <w:highlightCs w:val="yellow"/>
               </w:rPr>
-              <w:t xml:space="preserve">[Gruppengröße ergänzen]</w:t>
-            </w:r>
-          </w:p>
-        </w:tc>
-        <w:tc>
-          <w:tcPr>
-            <w:tcW w:type="dxa" w:w="3000"/>
-            <w:tcBorders>
-              <w:top w:val="single" w:color="C9DAD9" w:sz="4"/>
-              <w:left w:val="single" w:color="C9DAD9" w:sz="4"/>
-              <w:bottom w:val="single" w:color="C9DAD9" w:sz="4"/>
-              <w:right w:val="single" w:color="C9DAD9" w:sz="4"/>
-            </w:tcBorders>
-            <w:tcMar>
-              <w:top w:type="dxa" w:w="70"/>
-              <w:left w:type="dxa" w:w="110"/>
-              <w:bottom w:type="dxa" w:w="70"/>
-              <w:right w:type="dxa" w:w="110"/>
-            </w:tcMar>
-            <w:vAlign w:val="top"/>
-          </w:tcPr>
-          <w:p>
-            <w:pPr>
-              <w:spacing w:after="0" w:line="276"/>
-            </w:pPr>
-          </w:p>
-        </w:tc>
-      </w:tr>
-      <w:tr>
-        <w:trPr>
-          <w:cantSplit/>
-        </w:trPr>
-        <w:tc>
-          <w:tcPr>
-            <w:tcW w:type="dxa" w:w="2100"/>
-            <w:tcBorders>
-              <w:top w:val="single" w:color="C9DAD9" w:sz="4"/>
-              <w:left w:val="single" w:color="C9DAD9" w:sz="4"/>
-              <w:bottom w:val="single" w:color="C9DAD9" w:sz="4"/>
-              <w:right w:val="single" w:color="C9DAD9" w:sz="4"/>
-            </w:tcBorders>
-            <w:shd w:fill="E8F1F1" w:color="auto" w:val="clear"/>
-            <w:tcMar>
-              <w:top w:type="dxa" w:w="70"/>
-              <w:left w:type="dxa" w:w="110"/>
-              <w:bottom w:type="dxa" w:w="70"/>
-              <w:right w:type="dxa" w:w="110"/>
-            </w:tcMar>
-            <w:vAlign w:val="top"/>
-          </w:tcPr>
-          <w:p>
-            <w:pPr>
-              <w:spacing w:after="40" w:line="276"/>
-            </w:pPr>
-            <w:r>
-              <w:rPr>
-                <w:rFonts w:ascii="Calibri" w:cs="Calibri" w:eastAsia="Calibri" w:hAnsi="Calibri"/>
-                <w:b/>
-                <w:bCs/>
-                <w:color w:val="00416B"/>
-                <w:sz w:val="20"/>
-                <w:szCs w:val="20"/>
-              </w:rPr>
-              <w:t xml:space="preserve">Vorteil 5</w:t>
-            </w:r>
-          </w:p>
-        </w:tc>
-        <w:tc>
-          <w:tcPr>
-            <w:tcW w:type="dxa" w:w="4538"/>
-            <w:tcBorders>
-              <w:top w:val="single" w:color="C9DAD9" w:sz="4"/>
-              <w:left w:val="single" w:color="C9DAD9" w:sz="4"/>
-              <w:bottom w:val="single" w:color="C9DAD9" w:sz="4"/>
-              <w:right w:val="single" w:color="C9DAD9" w:sz="4"/>
-            </w:tcBorders>
-            <w:tcMar>
-              <w:top w:type="dxa" w:w="70"/>
-              <w:left w:type="dxa" w:w="110"/>
-              <w:bottom w:type="dxa" w:w="70"/>
-              <w:right w:type="dxa" w:w="110"/>
-            </w:tcMar>
-            <w:vAlign w:val="top"/>
-          </w:tcPr>
-          <w:p>
-            <w:pPr>
-              <w:spacing w:after="40" w:line="276"/>
-            </w:pPr>
-            <w:r>
-              <w:rPr>
-                <w:rFonts w:ascii="Calibri" w:cs="Calibri" w:eastAsia="Calibri" w:hAnsi="Calibri"/>
-                <w:sz w:val="21"/>
-                <w:szCs w:val="21"/>
-              </w:rPr>
-              <w:t xml:space="preserve">Anerkannte Zertifikate</w:t>
-            </w:r>
-          </w:p>
-          <w:p>
-            <w:pPr>
-              <w:spacing w:after="40" w:line="276"/>
-            </w:pPr>
-            <w:r>
-              <w:rPr>
-                <w:rFonts w:ascii="Calibri" w:cs="Calibri" w:eastAsia="Calibri" w:hAnsi="Calibri"/>
-                <w:sz w:val="21"/>
-                <w:szCs w:val="21"/>
-                <w:highlight w:val="yellow"/>
-                <w:highlightCs w:val="yellow"/>
-              </w:rPr>
               <w:t xml:space="preserve">[Anerkennung bestätigen]</w:t>
-            </w:r>
-          </w:p>
-        </w:tc>
-        <w:tc>
-          <w:tcPr>
-            <w:tcW w:type="dxa" w:w="3000"/>
-            <w:tcBorders>
-              <w:top w:val="single" w:color="C9DAD9" w:sz="4"/>
-              <w:left w:val="single" w:color="C9DAD9" w:sz="4"/>
-              <w:bottom w:val="single" w:color="C9DAD9" w:sz="4"/>
-              <w:right w:val="single" w:color="C9DAD9" w:sz="4"/>
-            </w:tcBorders>
-            <w:tcMar>
-              <w:top w:type="dxa" w:w="70"/>
-              <w:left w:type="dxa" w:w="110"/>
-              <w:bottom w:type="dxa" w:w="70"/>
-              <w:right w:type="dxa" w:w="110"/>
-            </w:tcMar>
-            <w:vAlign w:val="top"/>
-          </w:tcPr>
-          <w:p>
-            <w:pPr>
-              <w:spacing w:after="0" w:line="276"/>
-            </w:pPr>
-          </w:p>
-        </w:tc>
-      </w:tr>
-      <w:tr>
-        <w:trPr>
-          <w:cantSplit/>
-        </w:trPr>
-        <w:tc>
-          <w:tcPr>
-            <w:tcW w:type="dxa" w:w="2100"/>
-            <w:tcBorders>
-              <w:top w:val="single" w:color="C9DAD9" w:sz="4"/>
-              <w:left w:val="single" w:color="C9DAD9" w:sz="4"/>
-              <w:bottom w:val="single" w:color="C9DAD9" w:sz="4"/>
-              <w:right w:val="single" w:color="C9DAD9" w:sz="4"/>
-            </w:tcBorders>
-            <w:shd w:fill="E8F1F1" w:color="auto" w:val="clear"/>
-            <w:tcMar>
-              <w:top w:type="dxa" w:w="70"/>
-              <w:left w:type="dxa" w:w="110"/>
-              <w:bottom w:type="dxa" w:w="70"/>
-              <w:right w:type="dxa" w:w="110"/>
-            </w:tcMar>
-            <w:vAlign w:val="top"/>
-          </w:tcPr>
-          <w:p>
-            <w:pPr>
-              <w:spacing w:after="40" w:line="276"/>
-            </w:pPr>
-            <w:r>
-              <w:rPr>
-                <w:rFonts w:ascii="Calibri" w:cs="Calibri" w:eastAsia="Calibri" w:hAnsi="Calibri"/>
-                <w:b/>
-                <w:bCs/>
-                <w:color w:val="00416B"/>
-                <w:sz w:val="20"/>
-                <w:szCs w:val="20"/>
-              </w:rPr>
-              <w:t xml:space="preserve">Vorteil 6</w:t>
-            </w:r>
-          </w:p>
-        </w:tc>
-        <w:tc>
-          <w:tcPr>
-            <w:tcW w:type="dxa" w:w="4538"/>
-            <w:tcBorders>
-              <w:top w:val="single" w:color="C9DAD9" w:sz="4"/>
-              <w:left w:val="single" w:color="C9DAD9" w:sz="4"/>
-              <w:bottom w:val="single" w:color="C9DAD9" w:sz="4"/>
-              <w:right w:val="single" w:color="C9DAD9" w:sz="4"/>
-            </w:tcBorders>
-            <w:tcMar>
-              <w:top w:type="dxa" w:w="70"/>
-              <w:left w:type="dxa" w:w="110"/>
-              <w:bottom w:type="dxa" w:w="70"/>
-              <w:right w:type="dxa" w:w="110"/>
-            </w:tcMar>
-            <w:vAlign w:val="top"/>
-          </w:tcPr>
-          <w:p>
-            <w:pPr>
-              <w:spacing w:after="40" w:line="276"/>
-            </w:pPr>
-            <w:r>
-              <w:rPr>
-                <w:rFonts w:ascii="Calibri" w:cs="Calibri" w:eastAsia="Calibri" w:hAnsi="Calibri"/>
-                <w:sz w:val="21"/>
-                <w:szCs w:val="21"/>
-              </w:rPr>
-              <w:t xml:space="preserve">Flexible Termine</w:t>
-            </w:r>
-          </w:p>
-          <w:p>
-            <w:pPr>
-              <w:spacing w:after="40" w:line="276"/>
-            </w:pPr>
-            <w:r>
-              <w:rPr>
-                <w:rFonts w:ascii="Calibri" w:cs="Calibri" w:eastAsia="Calibri" w:hAnsi="Calibri"/>
-                <w:sz w:val="21"/>
-                <w:szCs w:val="21"/>
-                <w:highlight w:val="yellow"/>
-                <w:highlightCs w:val="yellow"/>
-              </w:rPr>
-              <w:t xml:space="preserve">[Präsenz, Online oder Blockformat ergänzen]</w:t>
             </w:r>
           </w:p>
         </w:tc>
@@ -5175,974 +4977,7 @@
         <w:rPr>
           <w:rFonts w:ascii="Calibri" w:cs="Calibri" w:eastAsia="Calibri" w:hAnsi="Calibri"/>
         </w:rPr>
-        <w:t xml:space="preserve">7. Sorgfalt vor großen Versprechen</w:t>
-      </w:r>
-    </w:p>
-    <w:p>
-      <w:pPr>
-        <w:keepNext/>
-        <w:spacing w:after="100" w:line="276"/>
-      </w:pPr>
-      <w:r>
-        <w:rPr>
-          <w:rFonts w:ascii="Calibri" w:cs="Calibri" w:eastAsia="Calibri" w:hAnsi="Calibri"/>
-          <w:i/>
-          <w:iCs/>
-          <w:color w:val="4B6269"/>
-          <w:sz w:val="20"/>
-          <w:szCs w:val="20"/>
-        </w:rPr>
-        <w:t xml:space="preserve">Ein Text mit drei Schlagwörtern links und vier Karten rechts.</w:t>
-      </w:r>
-    </w:p>
-    <w:tbl>
-      <w:tblPr>
-        <w:tblW w:type="dxa" w:w="9638"/>
-        <w:tblBorders>
-          <w:top w:val="single" w:color="auto" w:sz="4"/>
-          <w:left w:val="single" w:color="auto" w:sz="4"/>
-          <w:bottom w:val="single" w:color="auto" w:sz="4"/>
-          <w:right w:val="single" w:color="auto" w:sz="4"/>
-          <w:insideH w:val="single" w:color="auto" w:sz="4"/>
-          <w:insideV w:val="single" w:color="auto" w:sz="4"/>
-        </w:tblBorders>
-      </w:tblPr>
-      <w:tblGrid>
-        <w:gridCol w:w="2100"/>
-        <w:gridCol w:w="4538"/>
-        <w:gridCol w:w="3000"/>
-      </w:tblGrid>
-      <w:tr>
-        <w:trPr>
-          <w:cantSplit/>
-          <w:tblHeader/>
-        </w:trPr>
-        <w:tc>
-          <w:tcPr>
-            <w:tcW w:type="dxa" w:w="2100"/>
-            <w:tcBorders>
-              <w:top w:val="single" w:color="C9DAD9" w:sz="4"/>
-              <w:left w:val="single" w:color="C9DAD9" w:sz="4"/>
-              <w:bottom w:val="single" w:color="C9DAD9" w:sz="4"/>
-              <w:right w:val="single" w:color="C9DAD9" w:sz="4"/>
-            </w:tcBorders>
-            <w:shd w:fill="00416B" w:color="auto" w:val="clear"/>
-            <w:tcMar>
-              <w:top w:type="dxa" w:w="70"/>
-              <w:left w:type="dxa" w:w="110"/>
-              <w:bottom w:type="dxa" w:w="70"/>
-              <w:right w:type="dxa" w:w="110"/>
-            </w:tcMar>
-            <w:vAlign w:val="top"/>
-          </w:tcPr>
-          <w:p>
-            <w:pPr>
-              <w:spacing w:after="0" w:line="276"/>
-            </w:pPr>
-            <w:r>
-              <w:rPr>
-                <w:rFonts w:ascii="Calibri" w:cs="Calibri" w:eastAsia="Calibri" w:hAnsi="Calibri"/>
-                <w:b/>
-                <w:bCs/>
-                <w:color w:val="FFFFFF"/>
-                <w:sz w:val="20"/>
-                <w:szCs w:val="20"/>
-              </w:rPr>
-              <w:t xml:space="preserve">Bereich</w:t>
-            </w:r>
-          </w:p>
-        </w:tc>
-        <w:tc>
-          <w:tcPr>
-            <w:tcW w:type="dxa" w:w="4538"/>
-            <w:tcBorders>
-              <w:top w:val="single" w:color="C9DAD9" w:sz="4"/>
-              <w:left w:val="single" w:color="C9DAD9" w:sz="4"/>
-              <w:bottom w:val="single" w:color="C9DAD9" w:sz="4"/>
-              <w:right w:val="single" w:color="C9DAD9" w:sz="4"/>
-            </w:tcBorders>
-            <w:shd w:fill="00416B" w:color="auto" w:val="clear"/>
-            <w:tcMar>
-              <w:top w:type="dxa" w:w="70"/>
-              <w:left w:type="dxa" w:w="110"/>
-              <w:bottom w:type="dxa" w:w="70"/>
-              <w:right w:type="dxa" w:w="110"/>
-            </w:tcMar>
-            <w:vAlign w:val="top"/>
-          </w:tcPr>
-          <w:p>
-            <w:pPr>
-              <w:spacing w:after="0" w:line="276"/>
-            </w:pPr>
-            <w:r>
-              <w:rPr>
-                <w:rFonts w:ascii="Calibri" w:cs="Calibri" w:eastAsia="Calibri" w:hAnsi="Calibri"/>
-                <w:b/>
-                <w:bCs/>
-                <w:color w:val="FFFFFF"/>
-                <w:sz w:val="20"/>
-                <w:szCs w:val="20"/>
-              </w:rPr>
-              <w:t xml:space="preserve">Aktueller Text</w:t>
-            </w:r>
-          </w:p>
-        </w:tc>
-        <w:tc>
-          <w:tcPr>
-            <w:tcW w:type="dxa" w:w="3000"/>
-            <w:tcBorders>
-              <w:top w:val="single" w:color="C9DAD9" w:sz="4"/>
-              <w:left w:val="single" w:color="C9DAD9" w:sz="4"/>
-              <w:bottom w:val="single" w:color="C9DAD9" w:sz="4"/>
-              <w:right w:val="single" w:color="C9DAD9" w:sz="4"/>
-            </w:tcBorders>
-            <w:shd w:fill="00416B" w:color="auto" w:val="clear"/>
-            <w:tcMar>
-              <w:top w:type="dxa" w:w="70"/>
-              <w:left w:type="dxa" w:w="110"/>
-              <w:bottom w:type="dxa" w:w="70"/>
-              <w:right w:type="dxa" w:w="110"/>
-            </w:tcMar>
-            <w:vAlign w:val="top"/>
-          </w:tcPr>
-          <w:p>
-            <w:pPr>
-              <w:spacing w:after="0" w:line="276"/>
-            </w:pPr>
-            <w:r>
-              <w:rPr>
-                <w:rFonts w:ascii="Calibri" w:cs="Calibri" w:eastAsia="Calibri" w:hAnsi="Calibri"/>
-                <w:b/>
-                <w:bCs/>
-                <w:color w:val="FFFFFF"/>
-                <w:sz w:val="20"/>
-                <w:szCs w:val="20"/>
-              </w:rPr>
-              <w:t xml:space="preserve">Ihre Änderung / Anmerkung</w:t>
-            </w:r>
-          </w:p>
-        </w:tc>
-      </w:tr>
-      <w:tr>
-        <w:trPr>
-          <w:cantSplit/>
-        </w:trPr>
-        <w:tc>
-          <w:tcPr>
-            <w:tcW w:type="dxa" w:w="2100"/>
-            <w:tcBorders>
-              <w:top w:val="single" w:color="C9DAD9" w:sz="4"/>
-              <w:left w:val="single" w:color="C9DAD9" w:sz="4"/>
-              <w:bottom w:val="single" w:color="C9DAD9" w:sz="4"/>
-              <w:right w:val="single" w:color="C9DAD9" w:sz="4"/>
-            </w:tcBorders>
-            <w:shd w:fill="E8F1F1" w:color="auto" w:val="clear"/>
-            <w:tcMar>
-              <w:top w:type="dxa" w:w="70"/>
-              <w:left w:type="dxa" w:w="110"/>
-              <w:bottom w:type="dxa" w:w="70"/>
-              <w:right w:type="dxa" w:w="110"/>
-            </w:tcMar>
-            <w:vAlign w:val="top"/>
-          </w:tcPr>
-          <w:p>
-            <w:pPr>
-              <w:spacing w:after="40" w:line="276"/>
-            </w:pPr>
-            <w:r>
-              <w:rPr>
-                <w:rFonts w:ascii="Calibri" w:cs="Calibri" w:eastAsia="Calibri" w:hAnsi="Calibri"/>
-                <w:b/>
-                <w:bCs/>
-                <w:color w:val="00416B"/>
-                <w:sz w:val="20"/>
-                <w:szCs w:val="20"/>
-              </w:rPr>
-              <w:t xml:space="preserve">Kleine Überschrift</w:t>
-            </w:r>
-          </w:p>
-        </w:tc>
-        <w:tc>
-          <w:tcPr>
-            <w:tcW w:type="dxa" w:w="4538"/>
-            <w:tcBorders>
-              <w:top w:val="single" w:color="C9DAD9" w:sz="4"/>
-              <w:left w:val="single" w:color="C9DAD9" w:sz="4"/>
-              <w:bottom w:val="single" w:color="C9DAD9" w:sz="4"/>
-              <w:right w:val="single" w:color="C9DAD9" w:sz="4"/>
-            </w:tcBorders>
-            <w:tcMar>
-              <w:top w:type="dxa" w:w="70"/>
-              <w:left w:type="dxa" w:w="110"/>
-              <w:bottom w:type="dxa" w:w="70"/>
-              <w:right w:type="dxa" w:w="110"/>
-            </w:tcMar>
-            <w:vAlign w:val="top"/>
-          </w:tcPr>
-          <w:p>
-            <w:pPr>
-              <w:spacing w:after="40" w:line="276"/>
-            </w:pPr>
-            <w:r>
-              <w:rPr>
-                <w:rFonts w:ascii="Calibri" w:cs="Calibri" w:eastAsia="Calibri" w:hAnsi="Calibri"/>
-                <w:sz w:val="21"/>
-                <w:szCs w:val="21"/>
-              </w:rPr>
-              <w:t xml:space="preserve">Warum diese Academy</w:t>
-            </w:r>
-          </w:p>
-        </w:tc>
-        <w:tc>
-          <w:tcPr>
-            <w:tcW w:type="dxa" w:w="3000"/>
-            <w:tcBorders>
-              <w:top w:val="single" w:color="C9DAD9" w:sz="4"/>
-              <w:left w:val="single" w:color="C9DAD9" w:sz="4"/>
-              <w:bottom w:val="single" w:color="C9DAD9" w:sz="4"/>
-              <w:right w:val="single" w:color="C9DAD9" w:sz="4"/>
-            </w:tcBorders>
-            <w:tcMar>
-              <w:top w:type="dxa" w:w="70"/>
-              <w:left w:type="dxa" w:w="110"/>
-              <w:bottom w:type="dxa" w:w="70"/>
-              <w:right w:type="dxa" w:w="110"/>
-            </w:tcMar>
-            <w:vAlign w:val="top"/>
-          </w:tcPr>
-          <w:p>
-            <w:pPr>
-              <w:spacing w:after="0" w:line="276"/>
-            </w:pPr>
-          </w:p>
-        </w:tc>
-      </w:tr>
-      <w:tr>
-        <w:trPr>
-          <w:cantSplit/>
-        </w:trPr>
-        <w:tc>
-          <w:tcPr>
-            <w:tcW w:type="dxa" w:w="2100"/>
-            <w:tcBorders>
-              <w:top w:val="single" w:color="C9DAD9" w:sz="4"/>
-              <w:left w:val="single" w:color="C9DAD9" w:sz="4"/>
-              <w:bottom w:val="single" w:color="C9DAD9" w:sz="4"/>
-              <w:right w:val="single" w:color="C9DAD9" w:sz="4"/>
-            </w:tcBorders>
-            <w:shd w:fill="E8F1F1" w:color="auto" w:val="clear"/>
-            <w:tcMar>
-              <w:top w:type="dxa" w:w="70"/>
-              <w:left w:type="dxa" w:w="110"/>
-              <w:bottom w:type="dxa" w:w="70"/>
-              <w:right w:type="dxa" w:w="110"/>
-            </w:tcMar>
-            <w:vAlign w:val="top"/>
-          </w:tcPr>
-          <w:p>
-            <w:pPr>
-              <w:spacing w:after="40" w:line="276"/>
-            </w:pPr>
-            <w:r>
-              <w:rPr>
-                <w:rFonts w:ascii="Calibri" w:cs="Calibri" w:eastAsia="Calibri" w:hAnsi="Calibri"/>
-                <w:b/>
-                <w:bCs/>
-                <w:color w:val="00416B"/>
-                <w:sz w:val="20"/>
-                <w:szCs w:val="20"/>
-              </w:rPr>
-              <w:t xml:space="preserve">Überschrift</w:t>
-            </w:r>
-          </w:p>
-        </w:tc>
-        <w:tc>
-          <w:tcPr>
-            <w:tcW w:type="dxa" w:w="4538"/>
-            <w:tcBorders>
-              <w:top w:val="single" w:color="C9DAD9" w:sz="4"/>
-              <w:left w:val="single" w:color="C9DAD9" w:sz="4"/>
-              <w:bottom w:val="single" w:color="C9DAD9" w:sz="4"/>
-              <w:right w:val="single" w:color="C9DAD9" w:sz="4"/>
-            </w:tcBorders>
-            <w:tcMar>
-              <w:top w:type="dxa" w:w="70"/>
-              <w:left w:type="dxa" w:w="110"/>
-              <w:bottom w:type="dxa" w:w="70"/>
-              <w:right w:type="dxa" w:w="110"/>
-            </w:tcMar>
-            <w:vAlign w:val="top"/>
-          </w:tcPr>
-          <w:p>
-            <w:pPr>
-              <w:spacing w:after="40" w:line="276"/>
-            </w:pPr>
-            <w:r>
-              <w:rPr>
-                <w:rFonts w:ascii="Calibri" w:cs="Calibri" w:eastAsia="Calibri" w:hAnsi="Calibri"/>
-                <w:sz w:val="21"/>
-                <w:szCs w:val="21"/>
-              </w:rPr>
-              <w:t xml:space="preserve">Sorgfalt vor großen Versprechen.</w:t>
-            </w:r>
-          </w:p>
-        </w:tc>
-        <w:tc>
-          <w:tcPr>
-            <w:tcW w:type="dxa" w:w="3000"/>
-            <w:tcBorders>
-              <w:top w:val="single" w:color="C9DAD9" w:sz="4"/>
-              <w:left w:val="single" w:color="C9DAD9" w:sz="4"/>
-              <w:bottom w:val="single" w:color="C9DAD9" w:sz="4"/>
-              <w:right w:val="single" w:color="C9DAD9" w:sz="4"/>
-            </w:tcBorders>
-            <w:tcMar>
-              <w:top w:type="dxa" w:w="70"/>
-              <w:left w:type="dxa" w:w="110"/>
-              <w:bottom w:type="dxa" w:w="70"/>
-              <w:right w:type="dxa" w:w="110"/>
-            </w:tcMar>
-            <w:vAlign w:val="top"/>
-          </w:tcPr>
-          <w:p>
-            <w:pPr>
-              <w:spacing w:after="0" w:line="276"/>
-            </w:pPr>
-          </w:p>
-        </w:tc>
-      </w:tr>
-      <w:tr>
-        <w:trPr>
-          <w:cantSplit/>
-        </w:trPr>
-        <w:tc>
-          <w:tcPr>
-            <w:tcW w:type="dxa" w:w="2100"/>
-            <w:tcBorders>
-              <w:top w:val="single" w:color="C9DAD9" w:sz="4"/>
-              <w:left w:val="single" w:color="C9DAD9" w:sz="4"/>
-              <w:bottom w:val="single" w:color="C9DAD9" w:sz="4"/>
-              <w:right w:val="single" w:color="C9DAD9" w:sz="4"/>
-            </w:tcBorders>
-            <w:shd w:fill="E8F1F1" w:color="auto" w:val="clear"/>
-            <w:tcMar>
-              <w:top w:type="dxa" w:w="70"/>
-              <w:left w:type="dxa" w:w="110"/>
-              <w:bottom w:type="dxa" w:w="70"/>
-              <w:right w:type="dxa" w:w="110"/>
-            </w:tcMar>
-            <w:vAlign w:val="top"/>
-          </w:tcPr>
-          <w:p>
-            <w:pPr>
-              <w:spacing w:after="40" w:line="276"/>
-            </w:pPr>
-            <w:r>
-              <w:rPr>
-                <w:rFonts w:ascii="Calibri" w:cs="Calibri" w:eastAsia="Calibri" w:hAnsi="Calibri"/>
-                <w:b/>
-                <w:bCs/>
-                <w:color w:val="00416B"/>
-                <w:sz w:val="20"/>
-                <w:szCs w:val="20"/>
-              </w:rPr>
-              <w:t xml:space="preserve">Text</w:t>
-            </w:r>
-          </w:p>
-        </w:tc>
-        <w:tc>
-          <w:tcPr>
-            <w:tcW w:type="dxa" w:w="4538"/>
-            <w:tcBorders>
-              <w:top w:val="single" w:color="C9DAD9" w:sz="4"/>
-              <w:left w:val="single" w:color="C9DAD9" w:sz="4"/>
-              <w:bottom w:val="single" w:color="C9DAD9" w:sz="4"/>
-              <w:right w:val="single" w:color="C9DAD9" w:sz="4"/>
-            </w:tcBorders>
-            <w:tcMar>
-              <w:top w:type="dxa" w:w="70"/>
-              <w:left w:type="dxa" w:w="110"/>
-              <w:bottom w:type="dxa" w:w="70"/>
-              <w:right w:type="dxa" w:w="110"/>
-            </w:tcMar>
-            <w:vAlign w:val="top"/>
-          </w:tcPr>
-          <w:p>
-            <w:pPr>
-              <w:spacing w:after="40" w:line="276"/>
-            </w:pPr>
-            <w:r>
-              <w:rPr>
-                <w:rFonts w:ascii="Calibri" w:cs="Calibri" w:eastAsia="Calibri" w:hAnsi="Calibri"/>
-                <w:sz w:val="21"/>
-                <w:szCs w:val="21"/>
-              </w:rPr>
-              <w:t xml:space="preserve">Hier geht es nicht um schnelle Rezepte. Die Academy schafft einen fundierten Rahmen, in dem Theorie, Erfahrung und professionelle Praxis miteinander in Gespräch kommen.</w:t>
-            </w:r>
-          </w:p>
-        </w:tc>
-        <w:tc>
-          <w:tcPr>
-            <w:tcW w:type="dxa" w:w="3000"/>
-            <w:tcBorders>
-              <w:top w:val="single" w:color="C9DAD9" w:sz="4"/>
-              <w:left w:val="single" w:color="C9DAD9" w:sz="4"/>
-              <w:bottom w:val="single" w:color="C9DAD9" w:sz="4"/>
-              <w:right w:val="single" w:color="C9DAD9" w:sz="4"/>
-            </w:tcBorders>
-            <w:tcMar>
-              <w:top w:type="dxa" w:w="70"/>
-              <w:left w:type="dxa" w:w="110"/>
-              <w:bottom w:type="dxa" w:w="70"/>
-              <w:right w:type="dxa" w:w="110"/>
-            </w:tcMar>
-            <w:vAlign w:val="top"/>
-          </w:tcPr>
-          <w:p>
-            <w:pPr>
-              <w:spacing w:after="0" w:line="276"/>
-            </w:pPr>
-          </w:p>
-        </w:tc>
-      </w:tr>
-      <w:tr>
-        <w:trPr>
-          <w:cantSplit/>
-        </w:trPr>
-        <w:tc>
-          <w:tcPr>
-            <w:tcW w:type="dxa" w:w="2100"/>
-            <w:tcBorders>
-              <w:top w:val="single" w:color="C9DAD9" w:sz="4"/>
-              <w:left w:val="single" w:color="C9DAD9" w:sz="4"/>
-              <w:bottom w:val="single" w:color="C9DAD9" w:sz="4"/>
-              <w:right w:val="single" w:color="C9DAD9" w:sz="4"/>
-            </w:tcBorders>
-            <w:shd w:fill="E8F1F1" w:color="auto" w:val="clear"/>
-            <w:tcMar>
-              <w:top w:type="dxa" w:w="70"/>
-              <w:left w:type="dxa" w:w="110"/>
-              <w:bottom w:type="dxa" w:w="70"/>
-              <w:right w:type="dxa" w:w="110"/>
-            </w:tcMar>
-            <w:vAlign w:val="top"/>
-          </w:tcPr>
-          <w:p>
-            <w:pPr>
-              <w:spacing w:after="40" w:line="276"/>
-            </w:pPr>
-            <w:r>
-              <w:rPr>
-                <w:rFonts w:ascii="Calibri" w:cs="Calibri" w:eastAsia="Calibri" w:hAnsi="Calibri"/>
-                <w:b/>
-                <w:bCs/>
-                <w:color w:val="00416B"/>
-                <w:sz w:val="20"/>
-                <w:szCs w:val="20"/>
-              </w:rPr>
-              <w:t xml:space="preserve">Schlagwörter</w:t>
-            </w:r>
-          </w:p>
-        </w:tc>
-        <w:tc>
-          <w:tcPr>
-            <w:tcW w:type="dxa" w:w="4538"/>
-            <w:tcBorders>
-              <w:top w:val="single" w:color="C9DAD9" w:sz="4"/>
-              <w:left w:val="single" w:color="C9DAD9" w:sz="4"/>
-              <w:bottom w:val="single" w:color="C9DAD9" w:sz="4"/>
-              <w:right w:val="single" w:color="C9DAD9" w:sz="4"/>
-            </w:tcBorders>
-            <w:tcMar>
-              <w:top w:type="dxa" w:w="70"/>
-              <w:left w:type="dxa" w:w="110"/>
-              <w:bottom w:type="dxa" w:w="70"/>
-              <w:right w:type="dxa" w:w="110"/>
-            </w:tcMar>
-            <w:vAlign w:val="top"/>
-          </w:tcPr>
-          <w:p>
-            <w:pPr>
-              <w:spacing w:after="40" w:line="276"/>
-            </w:pPr>
-            <w:r>
-              <w:rPr>
-                <w:rFonts w:ascii="Calibri" w:cs="Calibri" w:eastAsia="Calibri" w:hAnsi="Calibri"/>
-                <w:sz w:val="21"/>
-                <w:szCs w:val="21"/>
-              </w:rPr>
-              <w:t xml:space="preserve">Forschungsorientiert · Praxisbezogen · Persönlich begleitet</w:t>
-            </w:r>
-          </w:p>
-        </w:tc>
-        <w:tc>
-          <w:tcPr>
-            <w:tcW w:type="dxa" w:w="3000"/>
-            <w:tcBorders>
-              <w:top w:val="single" w:color="C9DAD9" w:sz="4"/>
-              <w:left w:val="single" w:color="C9DAD9" w:sz="4"/>
-              <w:bottom w:val="single" w:color="C9DAD9" w:sz="4"/>
-              <w:right w:val="single" w:color="C9DAD9" w:sz="4"/>
-            </w:tcBorders>
-            <w:tcMar>
-              <w:top w:type="dxa" w:w="70"/>
-              <w:left w:type="dxa" w:w="110"/>
-              <w:bottom w:type="dxa" w:w="70"/>
-              <w:right w:type="dxa" w:w="110"/>
-            </w:tcMar>
-            <w:vAlign w:val="top"/>
-          </w:tcPr>
-          <w:p>
-            <w:pPr>
-              <w:spacing w:after="0" w:line="276"/>
-            </w:pPr>
-          </w:p>
-        </w:tc>
-      </w:tr>
-      <w:tr>
-        <w:trPr>
-          <w:cantSplit/>
-        </w:trPr>
-        <w:tc>
-          <w:tcPr>
-            <w:tcW w:type="dxa" w:w="2100"/>
-            <w:tcBorders>
-              <w:top w:val="single" w:color="C9DAD9" w:sz="4"/>
-              <w:left w:val="single" w:color="C9DAD9" w:sz="4"/>
-              <w:bottom w:val="single" w:color="C9DAD9" w:sz="4"/>
-              <w:right w:val="single" w:color="C9DAD9" w:sz="4"/>
-            </w:tcBorders>
-            <w:shd w:fill="E8F1F1" w:color="auto" w:val="clear"/>
-            <w:tcMar>
-              <w:top w:type="dxa" w:w="70"/>
-              <w:left w:type="dxa" w:w="110"/>
-              <w:bottom w:type="dxa" w:w="70"/>
-              <w:right w:type="dxa" w:w="110"/>
-            </w:tcMar>
-            <w:vAlign w:val="top"/>
-          </w:tcPr>
-          <w:p>
-            <w:pPr>
-              <w:spacing w:after="40" w:line="276"/>
-            </w:pPr>
-            <w:r>
-              <w:rPr>
-                <w:rFonts w:ascii="Calibri" w:cs="Calibri" w:eastAsia="Calibri" w:hAnsi="Calibri"/>
-                <w:b/>
-                <w:bCs/>
-                <w:color w:val="00416B"/>
-                <w:sz w:val="20"/>
-                <w:szCs w:val="20"/>
-              </w:rPr>
-              <w:t xml:space="preserve">Karte 1</w:t>
-            </w:r>
-          </w:p>
-        </w:tc>
-        <w:tc>
-          <w:tcPr>
-            <w:tcW w:type="dxa" w:w="4538"/>
-            <w:tcBorders>
-              <w:top w:val="single" w:color="C9DAD9" w:sz="4"/>
-              <w:left w:val="single" w:color="C9DAD9" w:sz="4"/>
-              <w:bottom w:val="single" w:color="C9DAD9" w:sz="4"/>
-              <w:right w:val="single" w:color="C9DAD9" w:sz="4"/>
-            </w:tcBorders>
-            <w:tcMar>
-              <w:top w:type="dxa" w:w="70"/>
-              <w:left w:type="dxa" w:w="110"/>
-              <w:bottom w:type="dxa" w:w="70"/>
-              <w:right w:type="dxa" w:w="110"/>
-            </w:tcMar>
-            <w:vAlign w:val="top"/>
-          </w:tcPr>
-          <w:p>
-            <w:pPr>
-              <w:spacing w:after="40" w:line="276"/>
-            </w:pPr>
-            <w:r>
-              <w:rPr>
-                <w:rFonts w:ascii="Calibri" w:cs="Calibri" w:eastAsia="Calibri" w:hAnsi="Calibri"/>
-                <w:sz w:val="21"/>
-                <w:szCs w:val="21"/>
-              </w:rPr>
-              <w:t xml:space="preserve">Wissenschaftlich orientiert</w:t>
-            </w:r>
-          </w:p>
-          <w:p>
-            <w:pPr>
-              <w:spacing w:after="40" w:line="276"/>
-            </w:pPr>
-            <w:r>
-              <w:rPr>
-                <w:rFonts w:ascii="Calibri" w:cs="Calibri" w:eastAsia="Calibri" w:hAnsi="Calibri"/>
-                <w:sz w:val="21"/>
-                <w:szCs w:val="21"/>
-              </w:rPr>
-              <w:t xml:space="preserve">Inhalte werden nachvollziehbar kontextualisiert statt verkürzt vermittelt.</w:t>
-            </w:r>
-          </w:p>
-        </w:tc>
-        <w:tc>
-          <w:tcPr>
-            <w:tcW w:type="dxa" w:w="3000"/>
-            <w:tcBorders>
-              <w:top w:val="single" w:color="C9DAD9" w:sz="4"/>
-              <w:left w:val="single" w:color="C9DAD9" w:sz="4"/>
-              <w:bottom w:val="single" w:color="C9DAD9" w:sz="4"/>
-              <w:right w:val="single" w:color="C9DAD9" w:sz="4"/>
-            </w:tcBorders>
-            <w:tcMar>
-              <w:top w:type="dxa" w:w="70"/>
-              <w:left w:type="dxa" w:w="110"/>
-              <w:bottom w:type="dxa" w:w="70"/>
-              <w:right w:type="dxa" w:w="110"/>
-            </w:tcMar>
-            <w:vAlign w:val="top"/>
-          </w:tcPr>
-          <w:p>
-            <w:pPr>
-              <w:spacing w:after="0" w:line="276"/>
-            </w:pPr>
-          </w:p>
-        </w:tc>
-      </w:tr>
-      <w:tr>
-        <w:trPr>
-          <w:cantSplit/>
-        </w:trPr>
-        <w:tc>
-          <w:tcPr>
-            <w:tcW w:type="dxa" w:w="2100"/>
-            <w:tcBorders>
-              <w:top w:val="single" w:color="C9DAD9" w:sz="4"/>
-              <w:left w:val="single" w:color="C9DAD9" w:sz="4"/>
-              <w:bottom w:val="single" w:color="C9DAD9" w:sz="4"/>
-              <w:right w:val="single" w:color="C9DAD9" w:sz="4"/>
-            </w:tcBorders>
-            <w:shd w:fill="E8F1F1" w:color="auto" w:val="clear"/>
-            <w:tcMar>
-              <w:top w:type="dxa" w:w="70"/>
-              <w:left w:type="dxa" w:w="110"/>
-              <w:bottom w:type="dxa" w:w="70"/>
-              <w:right w:type="dxa" w:w="110"/>
-            </w:tcMar>
-            <w:vAlign w:val="top"/>
-          </w:tcPr>
-          <w:p>
-            <w:pPr>
-              <w:spacing w:after="40" w:line="276"/>
-            </w:pPr>
-            <w:r>
-              <w:rPr>
-                <w:rFonts w:ascii="Calibri" w:cs="Calibri" w:eastAsia="Calibri" w:hAnsi="Calibri"/>
-                <w:b/>
-                <w:bCs/>
-                <w:color w:val="00416B"/>
-                <w:sz w:val="20"/>
-                <w:szCs w:val="20"/>
-              </w:rPr>
-              <w:t xml:space="preserve">Karte 2</w:t>
-            </w:r>
-          </w:p>
-        </w:tc>
-        <w:tc>
-          <w:tcPr>
-            <w:tcW w:type="dxa" w:w="4538"/>
-            <w:tcBorders>
-              <w:top w:val="single" w:color="C9DAD9" w:sz="4"/>
-              <w:left w:val="single" w:color="C9DAD9" w:sz="4"/>
-              <w:bottom w:val="single" w:color="C9DAD9" w:sz="4"/>
-              <w:right w:val="single" w:color="C9DAD9" w:sz="4"/>
-            </w:tcBorders>
-            <w:tcMar>
-              <w:top w:type="dxa" w:w="70"/>
-              <w:left w:type="dxa" w:w="110"/>
-              <w:bottom w:type="dxa" w:w="70"/>
-              <w:right w:type="dxa" w:w="110"/>
-            </w:tcMar>
-            <w:vAlign w:val="top"/>
-          </w:tcPr>
-          <w:p>
-            <w:pPr>
-              <w:spacing w:after="40" w:line="276"/>
-            </w:pPr>
-            <w:r>
-              <w:rPr>
-                <w:rFonts w:ascii="Calibri" w:cs="Calibri" w:eastAsia="Calibri" w:hAnsi="Calibri"/>
-                <w:sz w:val="21"/>
-                <w:szCs w:val="21"/>
-              </w:rPr>
-              <w:t xml:space="preserve">Fachlich vertieft</w:t>
-            </w:r>
-          </w:p>
-          <w:p>
-            <w:pPr>
-              <w:spacing w:after="40" w:line="276"/>
-            </w:pPr>
-            <w:r>
-              <w:rPr>
-                <w:rFonts w:ascii="Calibri" w:cs="Calibri" w:eastAsia="Calibri" w:hAnsi="Calibri"/>
-                <w:sz w:val="21"/>
-                <w:szCs w:val="21"/>
-              </w:rPr>
-              <w:t xml:space="preserve">Zusammenhänge erhalten Raum, damit Wissen tragfähig wird.</w:t>
-            </w:r>
-          </w:p>
-        </w:tc>
-        <w:tc>
-          <w:tcPr>
-            <w:tcW w:type="dxa" w:w="3000"/>
-            <w:tcBorders>
-              <w:top w:val="single" w:color="C9DAD9" w:sz="4"/>
-              <w:left w:val="single" w:color="C9DAD9" w:sz="4"/>
-              <w:bottom w:val="single" w:color="C9DAD9" w:sz="4"/>
-              <w:right w:val="single" w:color="C9DAD9" w:sz="4"/>
-            </w:tcBorders>
-            <w:tcMar>
-              <w:top w:type="dxa" w:w="70"/>
-              <w:left w:type="dxa" w:w="110"/>
-              <w:bottom w:type="dxa" w:w="70"/>
-              <w:right w:type="dxa" w:w="110"/>
-            </w:tcMar>
-            <w:vAlign w:val="top"/>
-          </w:tcPr>
-          <w:p>
-            <w:pPr>
-              <w:spacing w:after="0" w:line="276"/>
-            </w:pPr>
-          </w:p>
-        </w:tc>
-      </w:tr>
-      <w:tr>
-        <w:trPr>
-          <w:cantSplit/>
-        </w:trPr>
-        <w:tc>
-          <w:tcPr>
-            <w:tcW w:type="dxa" w:w="2100"/>
-            <w:tcBorders>
-              <w:top w:val="single" w:color="C9DAD9" w:sz="4"/>
-              <w:left w:val="single" w:color="C9DAD9" w:sz="4"/>
-              <w:bottom w:val="single" w:color="C9DAD9" w:sz="4"/>
-              <w:right w:val="single" w:color="C9DAD9" w:sz="4"/>
-            </w:tcBorders>
-            <w:shd w:fill="E8F1F1" w:color="auto" w:val="clear"/>
-            <w:tcMar>
-              <w:top w:type="dxa" w:w="70"/>
-              <w:left w:type="dxa" w:w="110"/>
-              <w:bottom w:type="dxa" w:w="70"/>
-              <w:right w:type="dxa" w:w="110"/>
-            </w:tcMar>
-            <w:vAlign w:val="top"/>
-          </w:tcPr>
-          <w:p>
-            <w:pPr>
-              <w:spacing w:after="40" w:line="276"/>
-            </w:pPr>
-            <w:r>
-              <w:rPr>
-                <w:rFonts w:ascii="Calibri" w:cs="Calibri" w:eastAsia="Calibri" w:hAnsi="Calibri"/>
-                <w:b/>
-                <w:bCs/>
-                <w:color w:val="00416B"/>
-                <w:sz w:val="20"/>
-                <w:szCs w:val="20"/>
-              </w:rPr>
-              <w:t xml:space="preserve">Karte 3</w:t>
-            </w:r>
-          </w:p>
-        </w:tc>
-        <w:tc>
-          <w:tcPr>
-            <w:tcW w:type="dxa" w:w="4538"/>
-            <w:tcBorders>
-              <w:top w:val="single" w:color="C9DAD9" w:sz="4"/>
-              <w:left w:val="single" w:color="C9DAD9" w:sz="4"/>
-              <w:bottom w:val="single" w:color="C9DAD9" w:sz="4"/>
-              <w:right w:val="single" w:color="C9DAD9" w:sz="4"/>
-            </w:tcBorders>
-            <w:tcMar>
-              <w:top w:type="dxa" w:w="70"/>
-              <w:left w:type="dxa" w:w="110"/>
-              <w:bottom w:type="dxa" w:w="70"/>
-              <w:right w:type="dxa" w:w="110"/>
-            </w:tcMar>
-            <w:vAlign w:val="top"/>
-          </w:tcPr>
-          <w:p>
-            <w:pPr>
-              <w:spacing w:after="40" w:line="276"/>
-            </w:pPr>
-            <w:r>
-              <w:rPr>
-                <w:rFonts w:ascii="Calibri" w:cs="Calibri" w:eastAsia="Calibri" w:hAnsi="Calibri"/>
-                <w:sz w:val="21"/>
-                <w:szCs w:val="21"/>
-              </w:rPr>
-              <w:t xml:space="preserve">Praxisnah gedacht</w:t>
-            </w:r>
-          </w:p>
-          <w:p>
-            <w:pPr>
-              <w:spacing w:after="40" w:line="276"/>
-            </w:pPr>
-            <w:r>
-              <w:rPr>
-                <w:rFonts w:ascii="Calibri" w:cs="Calibri" w:eastAsia="Calibri" w:hAnsi="Calibri"/>
-                <w:sz w:val="21"/>
-                <w:szCs w:val="21"/>
-              </w:rPr>
-              <w:t xml:space="preserve">Lernimpulse werden mit realen beruflichen und persönlichen Kontexten verbunden.</w:t>
-            </w:r>
-          </w:p>
-        </w:tc>
-        <w:tc>
-          <w:tcPr>
-            <w:tcW w:type="dxa" w:w="3000"/>
-            <w:tcBorders>
-              <w:top w:val="single" w:color="C9DAD9" w:sz="4"/>
-              <w:left w:val="single" w:color="C9DAD9" w:sz="4"/>
-              <w:bottom w:val="single" w:color="C9DAD9" w:sz="4"/>
-              <w:right w:val="single" w:color="C9DAD9" w:sz="4"/>
-            </w:tcBorders>
-            <w:tcMar>
-              <w:top w:type="dxa" w:w="70"/>
-              <w:left w:type="dxa" w:w="110"/>
-              <w:bottom w:type="dxa" w:w="70"/>
-              <w:right w:type="dxa" w:w="110"/>
-            </w:tcMar>
-            <w:vAlign w:val="top"/>
-          </w:tcPr>
-          <w:p>
-            <w:pPr>
-              <w:spacing w:after="0" w:line="276"/>
-            </w:pPr>
-          </w:p>
-        </w:tc>
-      </w:tr>
-      <w:tr>
-        <w:trPr>
-          <w:cantSplit/>
-        </w:trPr>
-        <w:tc>
-          <w:tcPr>
-            <w:tcW w:type="dxa" w:w="2100"/>
-            <w:tcBorders>
-              <w:top w:val="single" w:color="C9DAD9" w:sz="4"/>
-              <w:left w:val="single" w:color="C9DAD9" w:sz="4"/>
-              <w:bottom w:val="single" w:color="C9DAD9" w:sz="4"/>
-              <w:right w:val="single" w:color="C9DAD9" w:sz="4"/>
-            </w:tcBorders>
-            <w:shd w:fill="E8F1F1" w:color="auto" w:val="clear"/>
-            <w:tcMar>
-              <w:top w:type="dxa" w:w="70"/>
-              <w:left w:type="dxa" w:w="110"/>
-              <w:bottom w:type="dxa" w:w="70"/>
-              <w:right w:type="dxa" w:w="110"/>
-            </w:tcMar>
-            <w:vAlign w:val="top"/>
-          </w:tcPr>
-          <w:p>
-            <w:pPr>
-              <w:spacing w:after="40" w:line="276"/>
-            </w:pPr>
-            <w:r>
-              <w:rPr>
-                <w:rFonts w:ascii="Calibri" w:cs="Calibri" w:eastAsia="Calibri" w:hAnsi="Calibri"/>
-                <w:b/>
-                <w:bCs/>
-                <w:color w:val="00416B"/>
-                <w:sz w:val="20"/>
-                <w:szCs w:val="20"/>
-              </w:rPr>
-              <w:t xml:space="preserve">Karte 4</w:t>
-            </w:r>
-          </w:p>
-        </w:tc>
-        <w:tc>
-          <w:tcPr>
-            <w:tcW w:type="dxa" w:w="4538"/>
-            <w:tcBorders>
-              <w:top w:val="single" w:color="C9DAD9" w:sz="4"/>
-              <w:left w:val="single" w:color="C9DAD9" w:sz="4"/>
-              <w:bottom w:val="single" w:color="C9DAD9" w:sz="4"/>
-              <w:right w:val="single" w:color="C9DAD9" w:sz="4"/>
-            </w:tcBorders>
-            <w:tcMar>
-              <w:top w:type="dxa" w:w="70"/>
-              <w:left w:type="dxa" w:w="110"/>
-              <w:bottom w:type="dxa" w:w="70"/>
-              <w:right w:type="dxa" w:w="110"/>
-            </w:tcMar>
-            <w:vAlign w:val="top"/>
-          </w:tcPr>
-          <w:p>
-            <w:pPr>
-              <w:spacing w:after="40" w:line="276"/>
-            </w:pPr>
-            <w:r>
-              <w:rPr>
-                <w:rFonts w:ascii="Calibri" w:cs="Calibri" w:eastAsia="Calibri" w:hAnsi="Calibri"/>
-                <w:sz w:val="21"/>
-                <w:szCs w:val="21"/>
-              </w:rPr>
-              <w:t xml:space="preserve">Persönlich begleitet</w:t>
-            </w:r>
-          </w:p>
-          <w:p>
-            <w:pPr>
-              <w:spacing w:after="40" w:line="276"/>
-            </w:pPr>
-            <w:r>
-              <w:rPr>
-                <w:rFonts w:ascii="Calibri" w:cs="Calibri" w:eastAsia="Calibri" w:hAnsi="Calibri"/>
-                <w:sz w:val="21"/>
-                <w:szCs w:val="21"/>
-              </w:rPr>
-              <w:t xml:space="preserve">Fragen und Reflexion sind integraler Teil des Lernprozesses.</w:t>
-            </w:r>
-          </w:p>
-        </w:tc>
-        <w:tc>
-          <w:tcPr>
-            <w:tcW w:type="dxa" w:w="3000"/>
-            <w:tcBorders>
-              <w:top w:val="single" w:color="C9DAD9" w:sz="4"/>
-              <w:left w:val="single" w:color="C9DAD9" w:sz="4"/>
-              <w:bottom w:val="single" w:color="C9DAD9" w:sz="4"/>
-              <w:right w:val="single" w:color="C9DAD9" w:sz="4"/>
-            </w:tcBorders>
-            <w:tcMar>
-              <w:top w:type="dxa" w:w="70"/>
-              <w:left w:type="dxa" w:w="110"/>
-              <w:bottom w:type="dxa" w:w="70"/>
-              <w:right w:type="dxa" w:w="110"/>
-            </w:tcMar>
-            <w:vAlign w:val="top"/>
-          </w:tcPr>
-          <w:p>
-            <w:pPr>
-              <w:spacing w:after="0" w:line="276"/>
-            </w:pPr>
-          </w:p>
-        </w:tc>
-      </w:tr>
-    </w:tbl>
-    <w:p>
-      <w:pPr>
-        <w:spacing w:after="120"/>
-      </w:pPr>
-    </w:p>
-    <w:p>
-      <w:pPr>
-        <w:pStyle w:val="Heading2"/>
-        <w:keepNext/>
-      </w:pPr>
-      <w:r>
-        <w:rPr>
-          <w:rFonts w:ascii="Calibri" w:cs="Calibri" w:eastAsia="Calibri" w:hAnsi="Calibri"/>
-        </w:rPr>
-        <w:t xml:space="preserve">8. Die Köpfe der Academy (Team)</w:t>
+        <w:t xml:space="preserve">7. Die Köpfe der Academy (Team)</w:t>
       </w:r>
     </w:p>
     <w:p>
@@ -6544,7 +5379,7 @@
                 <w:sz w:val="21"/>
                 <w:szCs w:val="21"/>
               </w:rPr>
-              <w:t xml:space="preserve">Zwei Perspektiven, ein gemeinsames Anliegen: Positive Psychologie mit fachlicher Tiefe und zugewandter Klarheit zugänglich machen.</w:t>
+              <w:t xml:space="preserve">Zwei Perspektiven, ein gemeinsames Anliegen: Positive Psychologie mit fachlicher Tiefe und zugewandter Klarheit zugänglich machen. Gelehrt wird von Fachleuten mit Praxiserfahrung.</w:t>
             </w:r>
           </w:p>
         </w:tc>
@@ -6661,40 +5496,20 @@
                 <w:sz w:val="21"/>
                 <w:szCs w:val="21"/>
               </w:rPr>
-              <w:t xml:space="preserve">Rolle: </w:t>
-            </w:r>
-            <w:r>
-              <w:rPr>
-                <w:rFonts w:ascii="Calibri" w:cs="Calibri" w:eastAsia="Calibri" w:hAnsi="Calibri"/>
-                <w:sz w:val="21"/>
-                <w:szCs w:val="21"/>
-                <w:highlight w:val="yellow"/>
-                <w:highlightCs w:val="yellow"/>
-              </w:rPr>
-              <w:t xml:space="preserve">[Rolle]</w:t>
-            </w:r>
-          </w:p>
-          <w:p>
-            <w:pPr>
-              <w:spacing w:after="40" w:line="276"/>
-            </w:pPr>
-            <w:r>
-              <w:rPr>
-                <w:rFonts w:ascii="Calibri" w:cs="Calibri" w:eastAsia="Calibri" w:hAnsi="Calibri"/>
-                <w:sz w:val="21"/>
-                <w:szCs w:val="21"/>
-              </w:rPr>
-              <w:t xml:space="preserve">Name: </w:t>
-            </w:r>
-            <w:r>
-              <w:rPr>
-                <w:rFonts w:ascii="Calibri" w:cs="Calibri" w:eastAsia="Calibri" w:hAnsi="Calibri"/>
-                <w:sz w:val="21"/>
-                <w:szCs w:val="21"/>
-                <w:highlight w:val="yellow"/>
-                <w:highlightCs w:val="yellow"/>
-              </w:rPr>
-              <w:t xml:space="preserve">[Name 1]</w:t>
+              <w:t xml:space="preserve">Rolle: Founder</w:t>
+            </w:r>
+          </w:p>
+          <w:p>
+            <w:pPr>
+              <w:spacing w:after="40" w:line="276"/>
+            </w:pPr>
+            <w:r>
+              <w:rPr>
+                <w:rFonts w:ascii="Calibri" w:cs="Calibri" w:eastAsia="Calibri" w:hAnsi="Calibri"/>
+                <w:sz w:val="21"/>
+                <w:szCs w:val="21"/>
+              </w:rPr>
+              <w:t xml:space="preserve">Name: Mag. Michael Wohlkönig</w:t>
             </w:r>
           </w:p>
           <w:p>
@@ -7025,7 +5840,7 @@
         <w:rPr>
           <w:rFonts w:ascii="Calibri" w:cs="Calibri" w:eastAsia="Calibri" w:hAnsi="Calibri"/>
         </w:rPr>
-        <w:t xml:space="preserve">9. Kontakt-Hinweis</w:t>
+        <w:t xml:space="preserve">8. Kontakt-Hinweis</w:t>
       </w:r>
     </w:p>
     <w:p>
@@ -7564,7 +6379,7 @@
         <w:rPr>
           <w:rFonts w:ascii="Calibri" w:cs="Calibri" w:eastAsia="Calibri" w:hAnsi="Calibri"/>
         </w:rPr>
-        <w:t xml:space="preserve">10. Fußzeile</w:t>
+        <w:t xml:space="preserve">9. Fußzeile</w:t>
       </w:r>
     </w:p>
     <w:p>
@@ -7747,7 +6562,7 @@
                 <w:sz w:val="20"/>
                 <w:szCs w:val="20"/>
               </w:rPr>
-              <w:t xml:space="preserve">Name</w:t>
+              <w:t xml:space="preserve">Logo</w:t>
             </w:r>
           </w:p>
         </w:tc>
@@ -7778,20 +6593,7 @@
                 <w:sz w:val="21"/>
                 <w:szCs w:val="21"/>
               </w:rPr>
-              <w:t xml:space="preserve">PERMA Mind</w:t>
-            </w:r>
-          </w:p>
-          <w:p>
-            <w:pPr>
-              <w:spacing w:after="40" w:line="276"/>
-            </w:pPr>
-            <w:r>
-              <w:rPr>
-                <w:rFonts w:ascii="Calibri" w:cs="Calibri" w:eastAsia="Calibri" w:hAnsi="Calibri"/>
-                <w:sz w:val="21"/>
-                <w:szCs w:val="21"/>
-              </w:rPr>
-              <w:t xml:space="preserve">Academy für Positive Psychologie</w:t>
+              <w:t xml:space="preserve">Logo der Academy (weiße Variante auf dunklem Grund)</w:t>
             </w:r>
           </w:p>
         </w:tc>
@@ -7884,56 +6686,34 @@
                 <w:rFonts w:ascii="Calibri" w:cs="Calibri" w:eastAsia="Calibri" w:hAnsi="Calibri"/>
                 <w:sz w:val="21"/>
                 <w:szCs w:val="21"/>
-                <w:highlight w:val="yellow"/>
-                <w:highlightCs w:val="yellow"/>
-              </w:rPr>
-              <w:t xml:space="preserve">[Straße Nr., PLZ Ort]</w:t>
-            </w:r>
-          </w:p>
-          <w:p>
-            <w:pPr>
-              <w:spacing w:after="40" w:line="276"/>
-            </w:pPr>
-            <w:r>
-              <w:rPr>
-                <w:rFonts w:ascii="Calibri" w:cs="Calibri" w:eastAsia="Calibri" w:hAnsi="Calibri"/>
-                <w:sz w:val="21"/>
-                <w:szCs w:val="21"/>
-              </w:rPr>
-              <w:t xml:space="preserve">Tel: </w:t>
-            </w:r>
-            <w:r>
-              <w:rPr>
-                <w:rFonts w:ascii="Calibri" w:cs="Calibri" w:eastAsia="Calibri" w:hAnsi="Calibri"/>
-                <w:sz w:val="21"/>
-                <w:szCs w:val="21"/>
-                <w:highlight w:val="yellow"/>
-                <w:highlightCs w:val="yellow"/>
-              </w:rPr>
-              <w:t xml:space="preserve">[Telefon]</w:t>
-            </w:r>
-          </w:p>
-          <w:p>
-            <w:pPr>
-              <w:spacing w:after="40" w:line="276"/>
-            </w:pPr>
-            <w:r>
-              <w:rPr>
-                <w:rFonts w:ascii="Calibri" w:cs="Calibri" w:eastAsia="Calibri" w:hAnsi="Calibri"/>
-                <w:sz w:val="21"/>
-                <w:szCs w:val="21"/>
-              </w:rPr>
-              <w:t xml:space="preserve">Mail: </w:t>
-            </w:r>
-            <w:r>
-              <w:rPr>
-                <w:rFonts w:ascii="Calibri" w:cs="Calibri" w:eastAsia="Calibri" w:hAnsi="Calibri"/>
-                <w:sz w:val="21"/>
-                <w:szCs w:val="21"/>
-                <w:highlight w:val="yellow"/>
-                <w:highlightCs w:val="yellow"/>
-              </w:rPr>
-              <w:t xml:space="preserve">[E-Mail]</w:t>
+              </w:rPr>
+              <w:t xml:space="preserve">Plüddemanngasse 104, 8042 Graz, Österreich</w:t>
+            </w:r>
+          </w:p>
+          <w:p>
+            <w:pPr>
+              <w:spacing w:after="40" w:line="276"/>
+            </w:pPr>
+            <w:r>
+              <w:rPr>
+                <w:rFonts w:ascii="Calibri" w:cs="Calibri" w:eastAsia="Calibri" w:hAnsi="Calibri"/>
+                <w:sz w:val="21"/>
+                <w:szCs w:val="21"/>
+              </w:rPr>
+              <w:t xml:space="preserve">Tel: +43 676 511 2763</w:t>
+            </w:r>
+          </w:p>
+          <w:p>
+            <w:pPr>
+              <w:spacing w:after="40" w:line="276"/>
+            </w:pPr>
+            <w:r>
+              <w:rPr>
+                <w:rFonts w:ascii="Calibri" w:cs="Calibri" w:eastAsia="Calibri" w:hAnsi="Calibri"/>
+                <w:sz w:val="21"/>
+                <w:szCs w:val="21"/>
+              </w:rPr>
+              <w:t xml:space="preserve">Mail: michael@perma-academy.at</w:t>
             </w:r>
           </w:p>
         </w:tc>
@@ -9450,10 +8230,8 @@
                 <w:rFonts w:ascii="Calibri" w:cs="Calibri" w:eastAsia="Calibri" w:hAnsi="Calibri"/>
                 <w:sz w:val="21"/>
                 <w:szCs w:val="21"/>
-                <w:highlight w:val="yellow"/>
-                <w:highlightCs w:val="yellow"/>
-              </w:rPr>
-              <w:t xml:space="preserve">[E-Mail]</w:t>
+              </w:rPr>
+              <w:t xml:space="preserve">michael@perma-academy.at</w:t>
             </w:r>
           </w:p>
           <w:p>
@@ -9559,10 +8337,8 @@
                 <w:rFonts w:ascii="Calibri" w:cs="Calibri" w:eastAsia="Calibri" w:hAnsi="Calibri"/>
                 <w:sz w:val="21"/>
                 <w:szCs w:val="21"/>
-                <w:highlight w:val="yellow"/>
-                <w:highlightCs w:val="yellow"/>
-              </w:rPr>
-              <w:t xml:space="preserve">[Telefon]</w:t>
+              </w:rPr>
+              <w:t xml:space="preserve">+43 676 511 2763</w:t>
             </w:r>
           </w:p>
           <w:p>
@@ -9678,10 +8454,8 @@
                 <w:rFonts w:ascii="Calibri" w:cs="Calibri" w:eastAsia="Calibri" w:hAnsi="Calibri"/>
                 <w:sz w:val="21"/>
                 <w:szCs w:val="21"/>
-                <w:highlight w:val="yellow"/>
-                <w:highlightCs w:val="yellow"/>
-              </w:rPr>
-              <w:t xml:space="preserve">[Straße Nr., PLZ Ort]</w:t>
+              </w:rPr>
+              <w:t xml:space="preserve">Plüddemanngasse 104, 8042 Graz</w:t>
             </w:r>
           </w:p>
           <w:p>
@@ -9811,81 +8585,33 @@
                 <w:sz w:val="21"/>
                 <w:szCs w:val="21"/>
               </w:rPr>
-              <w:t xml:space="preserve">Name: </w:t>
-            </w:r>
-            <w:r>
-              <w:rPr>
-                <w:rFonts w:ascii="Calibri" w:cs="Calibri" w:eastAsia="Calibri" w:hAnsi="Calibri"/>
-                <w:sz w:val="21"/>
-                <w:szCs w:val="21"/>
-                <w:highlight w:val="yellow"/>
-                <w:highlightCs w:val="yellow"/>
-              </w:rPr>
-              <w:t xml:space="preserve">[Name]</w:t>
-            </w:r>
-          </w:p>
-          <w:p>
-            <w:pPr>
-              <w:spacing w:after="40" w:line="276"/>
-            </w:pPr>
-            <w:r>
-              <w:rPr>
-                <w:rFonts w:ascii="Calibri" w:cs="Calibri" w:eastAsia="Calibri" w:hAnsi="Calibri"/>
-                <w:sz w:val="21"/>
-                <w:szCs w:val="21"/>
-              </w:rPr>
-              <w:t xml:space="preserve">Funktion: </w:t>
-            </w:r>
-            <w:r>
-              <w:rPr>
-                <w:rFonts w:ascii="Calibri" w:cs="Calibri" w:eastAsia="Calibri" w:hAnsi="Calibri"/>
-                <w:sz w:val="21"/>
-                <w:szCs w:val="21"/>
-                <w:highlight w:val="yellow"/>
-                <w:highlightCs w:val="yellow"/>
-              </w:rPr>
-              <w:t xml:space="preserve">[Funktion, z. B. Leitung Organisation]</w:t>
-            </w:r>
-          </w:p>
-          <w:p>
-            <w:pPr>
-              <w:spacing w:after="40" w:line="276"/>
-            </w:pPr>
-            <w:r>
-              <w:rPr>
-                <w:rFonts w:ascii="Calibri" w:cs="Calibri" w:eastAsia="Calibri" w:hAnsi="Calibri"/>
-                <w:sz w:val="21"/>
-                <w:szCs w:val="21"/>
-              </w:rPr>
-              <w:t xml:space="preserve">Kontakt: </w:t>
-            </w:r>
-            <w:r>
-              <w:rPr>
-                <w:rFonts w:ascii="Calibri" w:cs="Calibri" w:eastAsia="Calibri" w:hAnsi="Calibri"/>
-                <w:sz w:val="21"/>
-                <w:szCs w:val="21"/>
-                <w:highlight w:val="yellow"/>
-                <w:highlightCs w:val="yellow"/>
-              </w:rPr>
-              <w:t xml:space="preserve">[Telefon]</w:t>
-            </w:r>
-            <w:r>
-              <w:rPr>
-                <w:rFonts w:ascii="Calibri" w:cs="Calibri" w:eastAsia="Calibri" w:hAnsi="Calibri"/>
-                <w:sz w:val="21"/>
-                <w:szCs w:val="21"/>
-              </w:rPr>
-              <w:t xml:space="preserve"> · </w:t>
-            </w:r>
-            <w:r>
-              <w:rPr>
-                <w:rFonts w:ascii="Calibri" w:cs="Calibri" w:eastAsia="Calibri" w:hAnsi="Calibri"/>
-                <w:sz w:val="21"/>
-                <w:szCs w:val="21"/>
-                <w:highlight w:val="yellow"/>
-                <w:highlightCs w:val="yellow"/>
-              </w:rPr>
-              <w:t xml:space="preserve">[E-Mail]</w:t>
+              <w:t xml:space="preserve">Name: Mag. Michael Wohlkönig</w:t>
+            </w:r>
+          </w:p>
+          <w:p>
+            <w:pPr>
+              <w:spacing w:after="40" w:line="276"/>
+            </w:pPr>
+            <w:r>
+              <w:rPr>
+                <w:rFonts w:ascii="Calibri" w:cs="Calibri" w:eastAsia="Calibri" w:hAnsi="Calibri"/>
+                <w:sz w:val="21"/>
+                <w:szCs w:val="21"/>
+              </w:rPr>
+              <w:t xml:space="preserve">Funktion: Founder</w:t>
+            </w:r>
+          </w:p>
+          <w:p>
+            <w:pPr>
+              <w:spacing w:after="40" w:line="276"/>
+            </w:pPr>
+            <w:r>
+              <w:rPr>
+                <w:rFonts w:ascii="Calibri" w:cs="Calibri" w:eastAsia="Calibri" w:hAnsi="Calibri"/>
+                <w:sz w:val="21"/>
+                <w:szCs w:val="21"/>
+              </w:rPr>
+              <w:t xml:space="preserve">Kontakt: +43 676 511 2763 · michael@perma-academy.at</w:t>
             </w:r>
           </w:p>
           <w:p>
@@ -12006,25 +10732,21 @@
                 <w:rFonts w:ascii="Calibri" w:cs="Calibri" w:eastAsia="Calibri" w:hAnsi="Calibri"/>
                 <w:sz w:val="21"/>
                 <w:szCs w:val="21"/>
-                <w:highlight w:val="yellow"/>
-                <w:highlightCs w:val="yellow"/>
-              </w:rPr>
-              <w:t xml:space="preserve">[Straße Nr.]</w:t>
-            </w:r>
-          </w:p>
-          <w:p>
-            <w:pPr>
-              <w:spacing w:after="40" w:line="276"/>
-            </w:pPr>
-            <w:r>
-              <w:rPr>
-                <w:rFonts w:ascii="Calibri" w:cs="Calibri" w:eastAsia="Calibri" w:hAnsi="Calibri"/>
-                <w:sz w:val="21"/>
-                <w:szCs w:val="21"/>
-                <w:highlight w:val="yellow"/>
-                <w:highlightCs w:val="yellow"/>
-              </w:rPr>
-              <w:t xml:space="preserve">[PLZ Ort]</w:t>
+              </w:rPr>
+              <w:t xml:space="preserve">Plüddemanngasse 104</w:t>
+            </w:r>
+          </w:p>
+          <w:p>
+            <w:pPr>
+              <w:spacing w:after="40" w:line="276"/>
+            </w:pPr>
+            <w:r>
+              <w:rPr>
+                <w:rFonts w:ascii="Calibri" w:cs="Calibri" w:eastAsia="Calibri" w:hAnsi="Calibri"/>
+                <w:sz w:val="21"/>
+                <w:szCs w:val="21"/>
+              </w:rPr>
+              <w:t xml:space="preserve">8042 Graz</w:t>
             </w:r>
           </w:p>
           <w:p>
@@ -12131,63 +10853,33 @@
                 <w:sz w:val="21"/>
                 <w:szCs w:val="21"/>
               </w:rPr>
-              <w:t xml:space="preserve">Telefon: </w:t>
-            </w:r>
-            <w:r>
-              <w:rPr>
-                <w:rFonts w:ascii="Calibri" w:cs="Calibri" w:eastAsia="Calibri" w:hAnsi="Calibri"/>
-                <w:sz w:val="21"/>
-                <w:szCs w:val="21"/>
-                <w:highlight w:val="yellow"/>
-                <w:highlightCs w:val="yellow"/>
-              </w:rPr>
-              <w:t xml:space="preserve">[Telefon]</w:t>
-            </w:r>
-          </w:p>
-          <w:p>
-            <w:pPr>
-              <w:spacing w:after="40" w:line="276"/>
-            </w:pPr>
-            <w:r>
-              <w:rPr>
-                <w:rFonts w:ascii="Calibri" w:cs="Calibri" w:eastAsia="Calibri" w:hAnsi="Calibri"/>
-                <w:sz w:val="21"/>
-                <w:szCs w:val="21"/>
-              </w:rPr>
-              <w:t xml:space="preserve">E-Mail: </w:t>
-            </w:r>
-            <w:r>
-              <w:rPr>
-                <w:rFonts w:ascii="Calibri" w:cs="Calibri" w:eastAsia="Calibri" w:hAnsi="Calibri"/>
-                <w:sz w:val="21"/>
-                <w:szCs w:val="21"/>
-                <w:highlight w:val="yellow"/>
-                <w:highlightCs w:val="yellow"/>
-              </w:rPr>
-              <w:t xml:space="preserve">[E-Mail]</w:t>
-            </w:r>
-          </w:p>
-          <w:p>
-            <w:pPr>
-              <w:spacing w:after="40" w:line="276"/>
-            </w:pPr>
-            <w:r>
-              <w:rPr>
-                <w:rFonts w:ascii="Calibri" w:cs="Calibri" w:eastAsia="Calibri" w:hAnsi="Calibri"/>
-                <w:sz w:val="21"/>
-                <w:szCs w:val="21"/>
-              </w:rPr>
-              <w:t xml:space="preserve">Web: </w:t>
-            </w:r>
-            <w:r>
-              <w:rPr>
-                <w:rFonts w:ascii="Calibri" w:cs="Calibri" w:eastAsia="Calibri" w:hAnsi="Calibri"/>
-                <w:sz w:val="21"/>
-                <w:szCs w:val="21"/>
-                <w:highlight w:val="yellow"/>
-                <w:highlightCs w:val="yellow"/>
-              </w:rPr>
-              <w:t xml:space="preserve">[Domain]</w:t>
+              <w:t xml:space="preserve">Telefon: +43 676 511 2763</w:t>
+            </w:r>
+          </w:p>
+          <w:p>
+            <w:pPr>
+              <w:spacing w:after="40" w:line="276"/>
+            </w:pPr>
+            <w:r>
+              <w:rPr>
+                <w:rFonts w:ascii="Calibri" w:cs="Calibri" w:eastAsia="Calibri" w:hAnsi="Calibri"/>
+                <w:sz w:val="21"/>
+                <w:szCs w:val="21"/>
+              </w:rPr>
+              <w:t xml:space="preserve">E-Mail: michael@perma-academy.at</w:t>
+            </w:r>
+          </w:p>
+          <w:p>
+            <w:pPr>
+              <w:spacing w:after="40" w:line="276"/>
+            </w:pPr>
+            <w:r>
+              <w:rPr>
+                <w:rFonts w:ascii="Calibri" w:cs="Calibri" w:eastAsia="Calibri" w:hAnsi="Calibri"/>
+                <w:sz w:val="21"/>
+                <w:szCs w:val="21"/>
+              </w:rPr>
+              <w:t xml:space="preserve">Web: www.perma-academy.at</w:t>
             </w:r>
           </w:p>
         </w:tc>
@@ -13585,59 +12277,21 @@
                 <w:rFonts w:ascii="Calibri" w:cs="Calibri" w:eastAsia="Calibri" w:hAnsi="Calibri"/>
                 <w:sz w:val="21"/>
                 <w:szCs w:val="21"/>
-                <w:highlight w:val="yellow"/>
-                <w:highlightCs w:val="yellow"/>
-              </w:rPr>
-              <w:t xml:space="preserve">[Straße Nr., PLZ Ort]</w:t>
-            </w:r>
-            <w:r>
-              <w:rPr>
-                <w:rFonts w:ascii="Calibri" w:cs="Calibri" w:eastAsia="Calibri" w:hAnsi="Calibri"/>
-                <w:sz w:val="21"/>
-                <w:szCs w:val="21"/>
-              </w:rPr>
-              <w:t xml:space="preserve">, Österreich</w:t>
-            </w:r>
-          </w:p>
-          <w:p>
-            <w:pPr>
-              <w:spacing w:after="40" w:line="276"/>
-            </w:pPr>
-            <w:r>
-              <w:rPr>
-                <w:rFonts w:ascii="Calibri" w:cs="Calibri" w:eastAsia="Calibri" w:hAnsi="Calibri"/>
-                <w:sz w:val="21"/>
-                <w:szCs w:val="21"/>
-              </w:rPr>
-              <w:t xml:space="preserve">E-Mail: </w:t>
-            </w:r>
-            <w:r>
-              <w:rPr>
-                <w:rFonts w:ascii="Calibri" w:cs="Calibri" w:eastAsia="Calibri" w:hAnsi="Calibri"/>
-                <w:sz w:val="21"/>
-                <w:szCs w:val="21"/>
-                <w:highlight w:val="yellow"/>
-                <w:highlightCs w:val="yellow"/>
-              </w:rPr>
-              <w:t xml:space="preserve">[E-Mail]</w:t>
-            </w:r>
-            <w:r>
-              <w:rPr>
-                <w:rFonts w:ascii="Calibri" w:cs="Calibri" w:eastAsia="Calibri" w:hAnsi="Calibri"/>
-                <w:sz w:val="21"/>
-                <w:szCs w:val="21"/>
-              </w:rPr>
-              <w:t xml:space="preserve"> · Telefon: </w:t>
-            </w:r>
-            <w:r>
-              <w:rPr>
-                <w:rFonts w:ascii="Calibri" w:cs="Calibri" w:eastAsia="Calibri" w:hAnsi="Calibri"/>
-                <w:sz w:val="21"/>
-                <w:szCs w:val="21"/>
-                <w:highlight w:val="yellow"/>
-                <w:highlightCs w:val="yellow"/>
-              </w:rPr>
-              <w:t xml:space="preserve">[Telefon]</w:t>
+              </w:rPr>
+              <w:t xml:space="preserve">Plüddemanngasse 104, 8042 Graz, Österreich</w:t>
+            </w:r>
+          </w:p>
+          <w:p>
+            <w:pPr>
+              <w:spacing w:after="40" w:line="276"/>
+            </w:pPr>
+            <w:r>
+              <w:rPr>
+                <w:rFonts w:ascii="Calibri" w:cs="Calibri" w:eastAsia="Calibri" w:hAnsi="Calibri"/>
+                <w:sz w:val="21"/>
+                <w:szCs w:val="21"/>
+              </w:rPr>
+              <w:t xml:space="preserve">E-Mail: michael@perma-academy.at · Telefon: +43 676 511 2763</w:t>
             </w:r>
           </w:p>
           <w:p>
@@ -15036,7 +13690,7 @@
                 <w:sz w:val="20"/>
                 <w:szCs w:val="20"/>
               </w:rPr>
-              <w:t xml:space="preserve">1. Modulnamen, Reihenfolge und Dauer der vier Module</w:t>
+              <w:t xml:space="preserve">1. Modulnamen, Reihenfolge und Dauer der vier Module; Format und Termine</w:t>
             </w:r>
           </w:p>
         </w:tc>
@@ -15161,7 +13815,7 @@
                 <w:sz w:val="21"/>
                 <w:szCs w:val="21"/>
               </w:rPr>
-              <w:t xml:space="preserve">Startseite: Kachel 4, Abschnitt 5 (Zertifikat), Vorteil 5; Kontaktseite „Gut zu wissen“</w:t>
+              <w:t xml:space="preserve">Startseite: Kachel 4, Abschnitt 5 (Zertifikat), Abschnitt 6 (Karte 4); Kontaktseite „Gut zu wissen“</w:t>
             </w:r>
           </w:p>
         </w:tc>
@@ -15255,7 +13909,7 @@
                 <w:sz w:val="21"/>
                 <w:szCs w:val="21"/>
               </w:rPr>
-              <w:t xml:space="preserve">Startseite, Vorteil 4 „Kleine Gruppen“</w:t>
+              <w:t xml:space="preserve">Startseite, Abschnitt 6 (Karte 3 „Persönlich begleitet“)</w:t>
             </w:r>
           </w:p>
         </w:tc>
@@ -15318,7 +13972,7 @@
                 <w:sz w:val="20"/>
                 <w:szCs w:val="20"/>
               </w:rPr>
-              <w:t xml:space="preserve">4. Format der Termine: Präsenz, Online oder Blockformat</w:t>
+              <w:t xml:space="preserve">4. Team: Bestätigen, dass Mag. Michael Wohlkönig (Founder) als erste Person erscheint; Titel, Werdegang und Foto; zweite Person komplett; Zitate in eigenen Worten</w:t>
             </w:r>
           </w:p>
         </w:tc>
@@ -15349,7 +14003,7 @@
                 <w:sz w:val="21"/>
                 <w:szCs w:val="21"/>
               </w:rPr>
-              <w:t xml:space="preserve">Startseite, Vorteil 6 „Flexible Termine“</w:t>
+              <w:t xml:space="preserve">Startseite, Abschnitt 7</w:t>
             </w:r>
           </w:p>
         </w:tc>
@@ -15412,7 +14066,7 @@
                 <w:sz w:val="20"/>
                 <w:szCs w:val="20"/>
               </w:rPr>
-              <w:t xml:space="preserve">5. Team: Namen, Rollen, Titel, Werdegang und Fotos der zwei Personen; Zitate in eigenen Worten</w:t>
+              <w:t xml:space="preserve">5. Kontaktdaten laut Visitenkarte bestätigen (Adresse, Telefon, E-Mail, Web)</w:t>
             </w:r>
           </w:p>
         </w:tc>
@@ -15443,7 +14097,7 @@
                 <w:sz w:val="21"/>
                 <w:szCs w:val="21"/>
               </w:rPr>
-              <w:t xml:space="preserve">Startseite, Abschnitt 8</w:t>
+              <w:t xml:space="preserve">Fußzeile; Kontaktseite; Impressum; Datenschutz</w:t>
             </w:r>
           </w:p>
         </w:tc>
@@ -15506,7 +14160,7 @@
                 <w:sz w:val="20"/>
                 <w:szCs w:val="20"/>
               </w:rPr>
-              <w:t xml:space="preserve">6. Adresse, Telefon und E-Mail der Academy</w:t>
+              <w:t xml:space="preserve">6. Links zu Instagram und LinkedIn</w:t>
             </w:r>
           </w:p>
         </w:tc>
@@ -15537,7 +14191,7 @@
                 <w:sz w:val="21"/>
                 <w:szCs w:val="21"/>
               </w:rPr>
-              <w:t xml:space="preserve">Fußzeile; Kontaktseite; Impressum</w:t>
+              <w:t xml:space="preserve">Fußzeile</w:t>
             </w:r>
           </w:p>
         </w:tc>
@@ -15600,7 +14254,7 @@
                 <w:sz w:val="20"/>
                 <w:szCs w:val="20"/>
               </w:rPr>
-              <w:t xml:space="preserve">7. Links zu Instagram und LinkedIn</w:t>
+              <w:t xml:space="preserve">7. Ansprechperson bestätigen; Funktion, Antwortzeit und Erreichbarkeit</w:t>
             </w:r>
           </w:p>
         </w:tc>
@@ -15631,7 +14285,7 @@
                 <w:sz w:val="21"/>
                 <w:szCs w:val="21"/>
               </w:rPr>
-              <w:t xml:space="preserve">Fußzeile</w:t>
+              <w:t xml:space="preserve">Kontaktseite, Abschnitte 1 und 2</w:t>
             </w:r>
           </w:p>
         </w:tc>
@@ -15694,7 +14348,7 @@
                 <w:sz w:val="20"/>
                 <w:szCs w:val="20"/>
               </w:rPr>
-              <w:t xml:space="preserve">8. Ansprechperson mit Funktion, Antwortzeit und Erreichbarkeit</w:t>
+              <w:t xml:space="preserve">8. Firmenangaben: Name mit Rechtsform, Firmenbuchnummer und -gericht, UID, Kammer/Fachgruppe, Gewerbebehörde, verantwortliche Person</w:t>
             </w:r>
           </w:p>
         </w:tc>
@@ -15725,7 +14379,7 @@
                 <w:sz w:val="21"/>
                 <w:szCs w:val="21"/>
               </w:rPr>
-              <w:t xml:space="preserve">Kontaktseite, Abschnitte 1 und 2</w:t>
+              <w:t xml:space="preserve">Impressum</w:t>
             </w:r>
           </w:p>
         </w:tc>
@@ -15788,7 +14442,7 @@
                 <w:sz w:val="20"/>
                 <w:szCs w:val="20"/>
               </w:rPr>
-              <w:t xml:space="preserve">9. Firmenangaben: Name mit Rechtsform, Firmenbuchnummer und -gericht, UID, Kammer/Fachgruppe, Gewerbebehörde, verantwortliche Person</w:t>
+              <w:t xml:space="preserve">9. Bildquellen (Fotografin oder Fotograf) und Stand</w:t>
             </w:r>
           </w:p>
         </w:tc>
@@ -15819,7 +14473,7 @@
                 <w:sz w:val="21"/>
                 <w:szCs w:val="21"/>
               </w:rPr>
-              <w:t xml:space="preserve">Impressum</w:t>
+              <w:t xml:space="preserve">Impressum, Bildnachweis</w:t>
             </w:r>
           </w:p>
         </w:tc>
@@ -15882,7 +14536,7 @@
                 <w:sz w:val="20"/>
                 <w:szCs w:val="20"/>
               </w:rPr>
-              <w:t xml:space="preserve">10. Bildquellen (Fotografin oder Fotograf) und Stand</w:t>
+              <w:t xml:space="preserve">10. Hosting-Anbieter, Löschfristen, Cookies, Schriftarten, Newsletter ja/nein</w:t>
             </w:r>
           </w:p>
         </w:tc>
@@ -15913,7 +14567,7 @@
                 <w:sz w:val="21"/>
                 <w:szCs w:val="21"/>
               </w:rPr>
-              <w:t xml:space="preserve">Impressum, Bildnachweis</w:t>
+              <w:t xml:space="preserve">Datenschutz</w:t>
             </w:r>
           </w:p>
         </w:tc>
@@ -15976,7 +14630,7 @@
                 <w:sz w:val="20"/>
                 <w:szCs w:val="20"/>
               </w:rPr>
-              <w:t xml:space="preserve">11. Hosting-Anbieter, Löschfristen, Cookies, Schriftarten, Newsletter ja/nein</w:t>
+              <w:t xml:space="preserve">11. Bilder: Hero-Bild und zwei Team-Fotos (das Siegel im Zertifikat-Bereich ist vorhanden)</w:t>
             </w:r>
           </w:p>
         </w:tc>
@@ -16007,101 +14661,7 @@
                 <w:sz w:val="21"/>
                 <w:szCs w:val="21"/>
               </w:rPr>
-              <w:t xml:space="preserve">Datenschutz</w:t>
-            </w:r>
-          </w:p>
-        </w:tc>
-        <w:tc>
-          <w:tcPr>
-            <w:tcW w:type="dxa" w:w="2738"/>
-            <w:tcBorders>
-              <w:top w:val="single" w:color="C9DAD9" w:sz="4"/>
-              <w:left w:val="single" w:color="C9DAD9" w:sz="4"/>
-              <w:bottom w:val="single" w:color="C9DAD9" w:sz="4"/>
-              <w:right w:val="single" w:color="C9DAD9" w:sz="4"/>
-            </w:tcBorders>
-            <w:tcMar>
-              <w:top w:type="dxa" w:w="70"/>
-              <w:left w:type="dxa" w:w="110"/>
-              <w:bottom w:type="dxa" w:w="70"/>
-              <w:right w:type="dxa" w:w="110"/>
-            </w:tcMar>
-            <w:vAlign w:val="top"/>
-          </w:tcPr>
-          <w:p>
-            <w:pPr>
-              <w:spacing w:after="0" w:line="276"/>
-            </w:pPr>
-          </w:p>
-        </w:tc>
-      </w:tr>
-      <w:tr>
-        <w:trPr>
-          <w:cantSplit/>
-        </w:trPr>
-        <w:tc>
-          <w:tcPr>
-            <w:tcW w:type="dxa" w:w="3900"/>
-            <w:tcBorders>
-              <w:top w:val="single" w:color="C9DAD9" w:sz="4"/>
-              <w:left w:val="single" w:color="C9DAD9" w:sz="4"/>
-              <w:bottom w:val="single" w:color="C9DAD9" w:sz="4"/>
-              <w:right w:val="single" w:color="C9DAD9" w:sz="4"/>
-            </w:tcBorders>
-            <w:shd w:fill="E8F1F1" w:color="auto" w:val="clear"/>
-            <w:tcMar>
-              <w:top w:type="dxa" w:w="70"/>
-              <w:left w:type="dxa" w:w="110"/>
-              <w:bottom w:type="dxa" w:w="70"/>
-              <w:right w:type="dxa" w:w="110"/>
-            </w:tcMar>
-            <w:vAlign w:val="top"/>
-          </w:tcPr>
-          <w:p>
-            <w:pPr>
-              <w:spacing w:after="40" w:line="276"/>
-            </w:pPr>
-            <w:r>
-              <w:rPr>
-                <w:rFonts w:ascii="Calibri" w:cs="Calibri" w:eastAsia="Calibri" w:hAnsi="Calibri"/>
-                <w:b/>
-                <w:bCs/>
-                <w:color w:val="00416B"/>
-                <w:sz w:val="20"/>
-                <w:szCs w:val="20"/>
-              </w:rPr>
-              <w:t xml:space="preserve">12. Bilder: Hero-Bild, Foto zum Abschnitt „Abschluss &amp; Zertifikat“, zwei Team-Fotos</w:t>
-            </w:r>
-          </w:p>
-        </w:tc>
-        <w:tc>
-          <w:tcPr>
-            <w:tcW w:type="dxa" w:w="3000"/>
-            <w:tcBorders>
-              <w:top w:val="single" w:color="C9DAD9" w:sz="4"/>
-              <w:left w:val="single" w:color="C9DAD9" w:sz="4"/>
-              <w:bottom w:val="single" w:color="C9DAD9" w:sz="4"/>
-              <w:right w:val="single" w:color="C9DAD9" w:sz="4"/>
-            </w:tcBorders>
-            <w:tcMar>
-              <w:top w:type="dxa" w:w="70"/>
-              <w:left w:type="dxa" w:w="110"/>
-              <w:bottom w:type="dxa" w:w="70"/>
-              <w:right w:type="dxa" w:w="110"/>
-            </w:tcMar>
-            <w:vAlign w:val="top"/>
-          </w:tcPr>
-          <w:p>
-            <w:pPr>
-              <w:spacing w:after="40" w:line="276"/>
-            </w:pPr>
-            <w:r>
-              <w:rPr>
-                <w:rFonts w:ascii="Calibri" w:cs="Calibri" w:eastAsia="Calibri" w:hAnsi="Calibri"/>
-                <w:sz w:val="21"/>
-                <w:szCs w:val="21"/>
-              </w:rPr>
-              <w:t xml:space="preserve">Startseite, Abschnitte 2, 5 und 8</w:t>
+              <w:t xml:space="preserve">Startseite, Abschnitte 2 und 7</w:t>
             </w:r>
           </w:p>
         </w:tc>

</xml_diff>

<commit_message>
v2: Kennzahlen im Intro entfernt
Die zwei Kennzahlen (4 Module, 5 Dimensionen) entfallen, der Intro-Block bleibt
mit Einleitungstext, Lernraum und Claim. Word-Dokument und Doku angepasst.

Co-Authored-By: Claude Sonnet 5.5 <noreply@anthropic.com>
Claude-Session: https://claude.ai/code/session_01MKz4GkM4ZqiqVCjpUdowFX
</commit_message>
<xml_diff>
--- a/docs/Website-Inhalte-PERMA-Mind-Academy.docx
+++ b/docs/Website-Inhalte-PERMA-Mind-Academy.docx
@@ -1885,194 +1885,6 @@
                 <w:szCs w:val="21"/>
               </w:rPr>
               <w:t xml:space="preserve">Wissenschaftlich klar. Menschlich zugewandt.</w:t>
-            </w:r>
-          </w:p>
-        </w:tc>
-        <w:tc>
-          <w:tcPr>
-            <w:tcW w:type="dxa" w:w="3000"/>
-            <w:tcBorders>
-              <w:top w:val="single" w:color="C9DAD9" w:sz="4"/>
-              <w:left w:val="single" w:color="C9DAD9" w:sz="4"/>
-              <w:bottom w:val="single" w:color="C9DAD9" w:sz="4"/>
-              <w:right w:val="single" w:color="C9DAD9" w:sz="4"/>
-            </w:tcBorders>
-            <w:tcMar>
-              <w:top w:type="dxa" w:w="70"/>
-              <w:left w:type="dxa" w:w="110"/>
-              <w:bottom w:type="dxa" w:w="70"/>
-              <w:right w:type="dxa" w:w="110"/>
-            </w:tcMar>
-            <w:vAlign w:val="top"/>
-          </w:tcPr>
-          <w:p>
-            <w:pPr>
-              <w:spacing w:after="0" w:line="276"/>
-            </w:pPr>
-          </w:p>
-        </w:tc>
-      </w:tr>
-      <w:tr>
-        <w:trPr>
-          <w:cantSplit/>
-        </w:trPr>
-        <w:tc>
-          <w:tcPr>
-            <w:tcW w:type="dxa" w:w="2100"/>
-            <w:tcBorders>
-              <w:top w:val="single" w:color="C9DAD9" w:sz="4"/>
-              <w:left w:val="single" w:color="C9DAD9" w:sz="4"/>
-              <w:bottom w:val="single" w:color="C9DAD9" w:sz="4"/>
-              <w:right w:val="single" w:color="C9DAD9" w:sz="4"/>
-            </w:tcBorders>
-            <w:shd w:fill="E8F1F1" w:color="auto" w:val="clear"/>
-            <w:tcMar>
-              <w:top w:type="dxa" w:w="70"/>
-              <w:left w:type="dxa" w:w="110"/>
-              <w:bottom w:type="dxa" w:w="70"/>
-              <w:right w:type="dxa" w:w="110"/>
-            </w:tcMar>
-            <w:vAlign w:val="top"/>
-          </w:tcPr>
-          <w:p>
-            <w:pPr>
-              <w:spacing w:after="40" w:line="276"/>
-            </w:pPr>
-            <w:r>
-              <w:rPr>
-                <w:rFonts w:ascii="Calibri" w:cs="Calibri" w:eastAsia="Calibri" w:hAnsi="Calibri"/>
-                <w:b/>
-                <w:bCs/>
-                <w:color w:val="00416B"/>
-                <w:sz w:val="20"/>
-                <w:szCs w:val="20"/>
-              </w:rPr>
-              <w:t xml:space="preserve">Kennzahl 1</w:t>
-            </w:r>
-          </w:p>
-        </w:tc>
-        <w:tc>
-          <w:tcPr>
-            <w:tcW w:type="dxa" w:w="4538"/>
-            <w:tcBorders>
-              <w:top w:val="single" w:color="C9DAD9" w:sz="4"/>
-              <w:left w:val="single" w:color="C9DAD9" w:sz="4"/>
-              <w:bottom w:val="single" w:color="C9DAD9" w:sz="4"/>
-              <w:right w:val="single" w:color="C9DAD9" w:sz="4"/>
-            </w:tcBorders>
-            <w:tcMar>
-              <w:top w:type="dxa" w:w="70"/>
-              <w:left w:type="dxa" w:w="110"/>
-              <w:bottom w:type="dxa" w:w="70"/>
-              <w:right w:type="dxa" w:w="110"/>
-            </w:tcMar>
-            <w:vAlign w:val="top"/>
-          </w:tcPr>
-          <w:p>
-            <w:pPr>
-              <w:spacing w:after="40" w:line="276"/>
-            </w:pPr>
-            <w:r>
-              <w:rPr>
-                <w:rFonts w:ascii="Calibri" w:cs="Calibri" w:eastAsia="Calibri" w:hAnsi="Calibri"/>
-                <w:sz w:val="21"/>
-                <w:szCs w:val="21"/>
-              </w:rPr>
-              <w:t xml:space="preserve">4 – Aufbauende Ausbildungsmodule</w:t>
-            </w:r>
-          </w:p>
-        </w:tc>
-        <w:tc>
-          <w:tcPr>
-            <w:tcW w:type="dxa" w:w="3000"/>
-            <w:tcBorders>
-              <w:top w:val="single" w:color="C9DAD9" w:sz="4"/>
-              <w:left w:val="single" w:color="C9DAD9" w:sz="4"/>
-              <w:bottom w:val="single" w:color="C9DAD9" w:sz="4"/>
-              <w:right w:val="single" w:color="C9DAD9" w:sz="4"/>
-            </w:tcBorders>
-            <w:tcMar>
-              <w:top w:type="dxa" w:w="70"/>
-              <w:left w:type="dxa" w:w="110"/>
-              <w:bottom w:type="dxa" w:w="70"/>
-              <w:right w:type="dxa" w:w="110"/>
-            </w:tcMar>
-            <w:vAlign w:val="top"/>
-          </w:tcPr>
-          <w:p>
-            <w:pPr>
-              <w:spacing w:after="0" w:line="276"/>
-            </w:pPr>
-          </w:p>
-        </w:tc>
-      </w:tr>
-      <w:tr>
-        <w:trPr>
-          <w:cantSplit/>
-        </w:trPr>
-        <w:tc>
-          <w:tcPr>
-            <w:tcW w:type="dxa" w:w="2100"/>
-            <w:tcBorders>
-              <w:top w:val="single" w:color="C9DAD9" w:sz="4"/>
-              <w:left w:val="single" w:color="C9DAD9" w:sz="4"/>
-              <w:bottom w:val="single" w:color="C9DAD9" w:sz="4"/>
-              <w:right w:val="single" w:color="C9DAD9" w:sz="4"/>
-            </w:tcBorders>
-            <w:shd w:fill="E8F1F1" w:color="auto" w:val="clear"/>
-            <w:tcMar>
-              <w:top w:type="dxa" w:w="70"/>
-              <w:left w:type="dxa" w:w="110"/>
-              <w:bottom w:type="dxa" w:w="70"/>
-              <w:right w:type="dxa" w:w="110"/>
-            </w:tcMar>
-            <w:vAlign w:val="top"/>
-          </w:tcPr>
-          <w:p>
-            <w:pPr>
-              <w:spacing w:after="40" w:line="276"/>
-            </w:pPr>
-            <w:r>
-              <w:rPr>
-                <w:rFonts w:ascii="Calibri" w:cs="Calibri" w:eastAsia="Calibri" w:hAnsi="Calibri"/>
-                <w:b/>
-                <w:bCs/>
-                <w:color w:val="00416B"/>
-                <w:sz w:val="20"/>
-                <w:szCs w:val="20"/>
-              </w:rPr>
-              <w:t xml:space="preserve">Kennzahl 2</w:t>
-            </w:r>
-          </w:p>
-        </w:tc>
-        <w:tc>
-          <w:tcPr>
-            <w:tcW w:type="dxa" w:w="4538"/>
-            <w:tcBorders>
-              <w:top w:val="single" w:color="C9DAD9" w:sz="4"/>
-              <w:left w:val="single" w:color="C9DAD9" w:sz="4"/>
-              <w:bottom w:val="single" w:color="C9DAD9" w:sz="4"/>
-              <w:right w:val="single" w:color="C9DAD9" w:sz="4"/>
-            </w:tcBorders>
-            <w:tcMar>
-              <w:top w:type="dxa" w:w="70"/>
-              <w:left w:type="dxa" w:w="110"/>
-              <w:bottom w:type="dxa" w:w="70"/>
-              <w:right w:type="dxa" w:w="110"/>
-            </w:tcMar>
-            <w:vAlign w:val="top"/>
-          </w:tcPr>
-          <w:p>
-            <w:pPr>
-              <w:spacing w:after="40" w:line="276"/>
-            </w:pPr>
-            <w:r>
-              <w:rPr>
-                <w:rFonts w:ascii="Calibri" w:cs="Calibri" w:eastAsia="Calibri" w:hAnsi="Calibri"/>
-                <w:sz w:val="21"/>
-                <w:szCs w:val="21"/>
-              </w:rPr>
-              <w:t xml:space="preserve">5 – Dimensionen des PERMA-Modells</w:t>
             </w:r>
           </w:p>
         </w:tc>

</xml_diff>

<commit_message>
v2: Team im neuen Layout, Warum PERMA Mind Academy? in Blau
Team: großes Porträt links mit Rollen-Feld, rechts Name, Titel, Kurzprofil,
Social-Icons, Werdegang mit Haken und Zitat. Warum-Abschnitt auf blauem Grund.
Word-Dokument und Doku angepasst.

Co-Authored-By: Claude Sonnet 5.5 <noreply@anthropic.com>
Claude-Session: https://claude.ai/code/session_01MKz4GkM4ZqiqVCjpUdowFX
</commit_message>
<xml_diff>
--- a/docs/Website-Inhalte-PERMA-Mind-Academy.docx
+++ b/docs/Website-Inhalte-PERMA-Mind-Academy.docx
@@ -3913,7 +3913,7 @@
           <w:sz w:val="20"/>
           <w:szCs w:val="20"/>
         </w:rPr>
-        <w:t xml:space="preserve">Ein Text links und vier Karten rechts, jeweils mit Icon in einer Akzentfarbe.</w:t>
+        <w:t xml:space="preserve">Ein Text links und vier Karten rechts, jeweils mit Icon in einer Akzentfarbe, auf blauem Grund.</w:t>
       </w:r>
     </w:p>
     <w:tbl>
@@ -4806,7 +4806,7 @@
           <w:sz w:val="20"/>
           <w:szCs w:val="20"/>
         </w:rPr>
-        <w:t xml:space="preserve">Zwei Personenkarten, jeweils mit Foto, Rolle, Name, Titel, Werdegang und einem Zitat in Schreibschrift. Die Zitate sind Entwürfe und bitte in eigenen Worten anpassen.</w:t>
+        <w:t xml:space="preserve">Zwei Personen untereinander, jeweils mit großem Foto links und rechts Name, Titel, Kurzprofil, Social-Media-Symbolen, Werdegang (drei Punkte) und einem Zitat in Schreibschrift. Die Zitate sind Entwürfe und bitte in eigenen Worten anpassen.</w:t>
       </w:r>
     </w:p>
     <w:tbl>
@@ -5297,18 +5297,26 @@
               </w:rPr>
               <w:t xml:space="preserve">[Foto Person 1]</w:t>
             </w:r>
-          </w:p>
-          <w:p>
-            <w:pPr>
-              <w:spacing w:after="40" w:line="276"/>
-            </w:pPr>
-            <w:r>
-              <w:rPr>
-                <w:rFonts w:ascii="Calibri" w:cs="Calibri" w:eastAsia="Calibri" w:hAnsi="Calibri"/>
-                <w:sz w:val="21"/>
-                <w:szCs w:val="21"/>
-              </w:rPr>
-              <w:t xml:space="preserve">Rolle: Founder</w:t>
+            <w:r>
+              <w:rPr>
+                <w:rFonts w:ascii="Calibri" w:cs="Calibri" w:eastAsia="Calibri" w:hAnsi="Calibri"/>
+                <w:sz w:val="21"/>
+                <w:szCs w:val="21"/>
+              </w:rPr>
+              <w:t xml:space="preserve"> (großes Porträt links)</w:t>
+            </w:r>
+          </w:p>
+          <w:p>
+            <w:pPr>
+              <w:spacing w:after="40" w:line="276"/>
+            </w:pPr>
+            <w:r>
+              <w:rPr>
+                <w:rFonts w:ascii="Calibri" w:cs="Calibri" w:eastAsia="Calibri" w:hAnsi="Calibri"/>
+                <w:sz w:val="21"/>
+                <w:szCs w:val="21"/>
+              </w:rPr>
+              <w:t xml:space="preserve">Rollen-Feld im Foto: Founder</w:t>
             </w:r>
           </w:p>
           <w:p>
@@ -5357,7 +5365,7 @@
                 <w:sz w:val="21"/>
                 <w:szCs w:val="21"/>
               </w:rPr>
-              <w:t xml:space="preserve">Werdegang: </w:t>
+              <w:t xml:space="preserve">Kurzprofil: </w:t>
             </w:r>
             <w:r>
               <w:rPr>
@@ -5367,20 +5375,102 @@
                 <w:highlight w:val="yellow"/>
                 <w:highlightCs w:val="yellow"/>
               </w:rPr>
-              <w:t xml:space="preserve">[Werdegang in 2 bis 3 Sätzen: Ausbildung, Berufserfahrung, Schwerpunkt]</w:t>
-            </w:r>
-          </w:p>
-          <w:p>
-            <w:pPr>
-              <w:spacing w:after="40" w:line="276"/>
-            </w:pPr>
-            <w:r>
-              <w:rPr>
-                <w:rFonts w:ascii="Calibri" w:cs="Calibri" w:eastAsia="Calibri" w:hAnsi="Calibri"/>
-                <w:sz w:val="21"/>
-                <w:szCs w:val="21"/>
-              </w:rPr>
-              <w:t xml:space="preserve">Zitat: „Wohlbefinden entsteht dort, wo Menschen ihre Stärken einsetzen dürfen.“ </w:t>
+              <w:t xml:space="preserve">[Kurzprofil in 2 bis 3 Sätzen]</w:t>
+            </w:r>
+          </w:p>
+          <w:p>
+            <w:pPr>
+              <w:spacing w:after="40" w:line="276"/>
+            </w:pPr>
+            <w:r>
+              <w:rPr>
+                <w:rFonts w:ascii="Calibri" w:cs="Calibri" w:eastAsia="Calibri" w:hAnsi="Calibri"/>
+                <w:sz w:val="21"/>
+                <w:szCs w:val="21"/>
+              </w:rPr>
+              <w:t xml:space="preserve">Social Media: LinkedIn und Instagram </w:t>
+            </w:r>
+            <w:r>
+              <w:rPr>
+                <w:rFonts w:ascii="Calibri" w:cs="Calibri" w:eastAsia="Calibri" w:hAnsi="Calibri"/>
+                <w:sz w:val="21"/>
+                <w:szCs w:val="21"/>
+                <w:highlight w:val="yellow"/>
+                <w:highlightCs w:val="yellow"/>
+              </w:rPr>
+              <w:t xml:space="preserve">[Links eintragen]</w:t>
+            </w:r>
+          </w:p>
+          <w:p>
+            <w:pPr>
+              <w:spacing w:after="40" w:line="276"/>
+            </w:pPr>
+            <w:r>
+              <w:rPr>
+                <w:rFonts w:ascii="Calibri" w:cs="Calibri" w:eastAsia="Calibri" w:hAnsi="Calibri"/>
+                <w:sz w:val="21"/>
+                <w:szCs w:val="21"/>
+              </w:rPr>
+              <w:t xml:space="preserve">Werdegang (drei Punkte mit Haken): Ausbildung: </w:t>
+            </w:r>
+            <w:r>
+              <w:rPr>
+                <w:rFonts w:ascii="Calibri" w:cs="Calibri" w:eastAsia="Calibri" w:hAnsi="Calibri"/>
+                <w:sz w:val="21"/>
+                <w:szCs w:val="21"/>
+                <w:highlight w:val="yellow"/>
+                <w:highlightCs w:val="yellow"/>
+              </w:rPr>
+              <w:t xml:space="preserve">[ergänzen]</w:t>
+            </w:r>
+            <w:r>
+              <w:rPr>
+                <w:rFonts w:ascii="Calibri" w:cs="Calibri" w:eastAsia="Calibri" w:hAnsi="Calibri"/>
+                <w:sz w:val="21"/>
+                <w:szCs w:val="21"/>
+              </w:rPr>
+              <w:t xml:space="preserve"> · Berufserfahrung: </w:t>
+            </w:r>
+            <w:r>
+              <w:rPr>
+                <w:rFonts w:ascii="Calibri" w:cs="Calibri" w:eastAsia="Calibri" w:hAnsi="Calibri"/>
+                <w:sz w:val="21"/>
+                <w:szCs w:val="21"/>
+                <w:highlight w:val="yellow"/>
+                <w:highlightCs w:val="yellow"/>
+              </w:rPr>
+              <w:t xml:space="preserve">[ergänzen]</w:t>
+            </w:r>
+            <w:r>
+              <w:rPr>
+                <w:rFonts w:ascii="Calibri" w:cs="Calibri" w:eastAsia="Calibri" w:hAnsi="Calibri"/>
+                <w:sz w:val="21"/>
+                <w:szCs w:val="21"/>
+              </w:rPr>
+              <w:t xml:space="preserve"> · Schwerpunkt: </w:t>
+            </w:r>
+            <w:r>
+              <w:rPr>
+                <w:rFonts w:ascii="Calibri" w:cs="Calibri" w:eastAsia="Calibri" w:hAnsi="Calibri"/>
+                <w:sz w:val="21"/>
+                <w:szCs w:val="21"/>
+                <w:highlight w:val="yellow"/>
+                <w:highlightCs w:val="yellow"/>
+              </w:rPr>
+              <w:t xml:space="preserve">[ergänzen]</w:t>
+            </w:r>
+          </w:p>
+          <w:p>
+            <w:pPr>
+              <w:spacing w:after="40" w:line="276"/>
+            </w:pPr>
+            <w:r>
+              <w:rPr>
+                <w:rFonts w:ascii="Calibri" w:cs="Calibri" w:eastAsia="Calibri" w:hAnsi="Calibri"/>
+                <w:sz w:val="21"/>
+                <w:szCs w:val="21"/>
+              </w:rPr>
+              <w:t xml:space="preserve">Zitat (Schreibschrift): „Wohlbefinden entsteht dort, wo Menschen ihre Stärken einsetzen dürfen.“ </w:t>
             </w:r>
             <w:r>
               <w:rPr>
@@ -5507,7 +5597,7 @@
                 <w:sz w:val="21"/>
                 <w:szCs w:val="21"/>
               </w:rPr>
-              <w:t xml:space="preserve">Rolle: </w:t>
+              <w:t xml:space="preserve">Rollen-Feld im Foto: </w:t>
             </w:r>
             <w:r>
               <w:rPr>
@@ -5576,7 +5666,7 @@
                 <w:sz w:val="21"/>
                 <w:szCs w:val="21"/>
               </w:rPr>
-              <w:t xml:space="preserve">Werdegang: </w:t>
+              <w:t xml:space="preserve">Kurzprofil: </w:t>
             </w:r>
             <w:r>
               <w:rPr>
@@ -5586,20 +5676,102 @@
                 <w:highlight w:val="yellow"/>
                 <w:highlightCs w:val="yellow"/>
               </w:rPr>
-              <w:t xml:space="preserve">[Werdegang in 2 bis 3 Sätzen: Ausbildung, Berufserfahrung, Schwerpunkt]</w:t>
-            </w:r>
-          </w:p>
-          <w:p>
-            <w:pPr>
-              <w:spacing w:after="40" w:line="276"/>
-            </w:pPr>
-            <w:r>
-              <w:rPr>
-                <w:rFonts w:ascii="Calibri" w:cs="Calibri" w:eastAsia="Calibri" w:hAnsi="Calibri"/>
-                <w:sz w:val="21"/>
-                <w:szCs w:val="21"/>
-              </w:rPr>
-              <w:t xml:space="preserve">Zitat: „Gute Beziehungen sind die verlässlichste Ressource, die wir haben.“ </w:t>
+              <w:t xml:space="preserve">[Kurzprofil in 2 bis 3 Sätzen]</w:t>
+            </w:r>
+          </w:p>
+          <w:p>
+            <w:pPr>
+              <w:spacing w:after="40" w:line="276"/>
+            </w:pPr>
+            <w:r>
+              <w:rPr>
+                <w:rFonts w:ascii="Calibri" w:cs="Calibri" w:eastAsia="Calibri" w:hAnsi="Calibri"/>
+                <w:sz w:val="21"/>
+                <w:szCs w:val="21"/>
+              </w:rPr>
+              <w:t xml:space="preserve">Social Media: LinkedIn und Instagram </w:t>
+            </w:r>
+            <w:r>
+              <w:rPr>
+                <w:rFonts w:ascii="Calibri" w:cs="Calibri" w:eastAsia="Calibri" w:hAnsi="Calibri"/>
+                <w:sz w:val="21"/>
+                <w:szCs w:val="21"/>
+                <w:highlight w:val="yellow"/>
+                <w:highlightCs w:val="yellow"/>
+              </w:rPr>
+              <w:t xml:space="preserve">[Links eintragen]</w:t>
+            </w:r>
+          </w:p>
+          <w:p>
+            <w:pPr>
+              <w:spacing w:after="40" w:line="276"/>
+            </w:pPr>
+            <w:r>
+              <w:rPr>
+                <w:rFonts w:ascii="Calibri" w:cs="Calibri" w:eastAsia="Calibri" w:hAnsi="Calibri"/>
+                <w:sz w:val="21"/>
+                <w:szCs w:val="21"/>
+              </w:rPr>
+              <w:t xml:space="preserve">Werdegang (drei Punkte mit Haken): Ausbildung: </w:t>
+            </w:r>
+            <w:r>
+              <w:rPr>
+                <w:rFonts w:ascii="Calibri" w:cs="Calibri" w:eastAsia="Calibri" w:hAnsi="Calibri"/>
+                <w:sz w:val="21"/>
+                <w:szCs w:val="21"/>
+                <w:highlight w:val="yellow"/>
+                <w:highlightCs w:val="yellow"/>
+              </w:rPr>
+              <w:t xml:space="preserve">[ergänzen]</w:t>
+            </w:r>
+            <w:r>
+              <w:rPr>
+                <w:rFonts w:ascii="Calibri" w:cs="Calibri" w:eastAsia="Calibri" w:hAnsi="Calibri"/>
+                <w:sz w:val="21"/>
+                <w:szCs w:val="21"/>
+              </w:rPr>
+              <w:t xml:space="preserve"> · Berufserfahrung: </w:t>
+            </w:r>
+            <w:r>
+              <w:rPr>
+                <w:rFonts w:ascii="Calibri" w:cs="Calibri" w:eastAsia="Calibri" w:hAnsi="Calibri"/>
+                <w:sz w:val="21"/>
+                <w:szCs w:val="21"/>
+                <w:highlight w:val="yellow"/>
+                <w:highlightCs w:val="yellow"/>
+              </w:rPr>
+              <w:t xml:space="preserve">[ergänzen]</w:t>
+            </w:r>
+            <w:r>
+              <w:rPr>
+                <w:rFonts w:ascii="Calibri" w:cs="Calibri" w:eastAsia="Calibri" w:hAnsi="Calibri"/>
+                <w:sz w:val="21"/>
+                <w:szCs w:val="21"/>
+              </w:rPr>
+              <w:t xml:space="preserve"> · Schwerpunkt: </w:t>
+            </w:r>
+            <w:r>
+              <w:rPr>
+                <w:rFonts w:ascii="Calibri" w:cs="Calibri" w:eastAsia="Calibri" w:hAnsi="Calibri"/>
+                <w:sz w:val="21"/>
+                <w:szCs w:val="21"/>
+                <w:highlight w:val="yellow"/>
+                <w:highlightCs w:val="yellow"/>
+              </w:rPr>
+              <w:t xml:space="preserve">[ergänzen]</w:t>
+            </w:r>
+          </w:p>
+          <w:p>
+            <w:pPr>
+              <w:spacing w:after="40" w:line="276"/>
+            </w:pPr>
+            <w:r>
+              <w:rPr>
+                <w:rFonts w:ascii="Calibri" w:cs="Calibri" w:eastAsia="Calibri" w:hAnsi="Calibri"/>
+                <w:sz w:val="21"/>
+                <w:szCs w:val="21"/>
+              </w:rPr>
+              <w:t xml:space="preserve">Zitat (Schreibschrift): „Gute Beziehungen sind die verlässlichste Ressource, die wir haben.“ </w:t>
             </w:r>
             <w:r>
               <w:rPr>
@@ -13784,7 +13956,7 @@
                 <w:sz w:val="20"/>
                 <w:szCs w:val="20"/>
               </w:rPr>
-              <w:t xml:space="preserve">4. Team: Bestätigen, dass Mag. Michael Wohlkönig (Founder) als erste Person erscheint; Titel, Werdegang und Foto; zweite Person komplett; Zitate in eigenen Worten</w:t>
+              <w:t xml:space="preserve">4. Team: Bestätigen, dass Mag. Michael Wohlkönig (Founder) als erste Person erscheint; Titel, Kurzprofil, Werdegang (Ausbildung, Berufserfahrung, Schwerpunkt), Social-Media-Links und Foto; zweite Person komplett; Zitate in eigenen Worten</w:t>
             </w:r>
           </w:p>
         </w:tc>

</xml_diff>